<commit_message>
Remove the quiz and homework slide, and put exact times in the plan.
The scheme uses the same clock, keeps Gia's terms, and leaves the assignment on the board rather than on the slides.

Co-authored-by: Beka Tevdorashvili <bekatev@users.noreply.github.com>
</commit_message>
<xml_diff>
--- a/lesson/gegma.docx
+++ b/lesson/gegma.docx
@@ -459,24 +459,1271 @@
           <w:color w:val="8E2F3C"/>
           <w:sz w:val="28"/>
         </w:rPr>
-        <w:t>როგორ მიდის</w:t>
+        <w:t>დრო. ზუსტად რა ხდება</w:t>
       </w:r>
     </w:p>
-    <w:p>
-      <w:pPr>
-        <w:spacing w:before="0" w:after="120" w:line="269" w:lineRule="auto"/>
-      </w:pPr>
-      <w:r>
-        <w:rPr>
-          <w:rFonts w:ascii="Sylfaen" w:hAnsi="Sylfaen" w:cs="Sylfaen" w:eastAsia="Sylfaen"/>
-          <w:b w:val="0"/>
-          <w:i w:val="0"/>
-          <w:color w:val="1C2430"/>
-          <w:sz w:val="24"/>
-        </w:rPr>
-        <w:t>თვისებას ჯერ წყვილი ხედავს ორი ანგარიშის შედარებით და თავისი სიტყვით ამბობს, რა არ შეიცვალა. სახელი დაფაზე მერე ჩნდება. სლაიდზე პასუხი და თვისების სახელი დახურულია, სანამ წყვილი არ იტყვის. ქულა არ იწერება. უკუკავშირი საქმეზეა: რა გამოუვიდა და სად აერია.</w:t>
-      </w:r>
-    </w:p>
+    <w:tbl>
+      <w:tblPr>
+        <w:tblW w:type="pct" w:w="5000"/>
+        <w:tblLook w:firstColumn="1" w:firstRow="1" w:lastColumn="0" w:lastRow="0" w:noHBand="0" w:noVBand="1" w:val="04A0"/>
+        <w:tblBorders>
+          <w:top w:val="nil"/>
+          <w:left w:val="nil"/>
+          <w:bottom w:val="nil"/>
+          <w:right w:val="nil"/>
+          <w:insideH w:val="nil"/>
+          <w:insideV w:val="nil"/>
+        </w:tblBorders>
+      </w:tblPr>
+      <w:tblGrid>
+        <w:gridCol w:w="3402"/>
+        <w:gridCol w:w="3402"/>
+        <w:gridCol w:w="3402"/>
+      </w:tblGrid>
+      <w:tr>
+        <w:trPr>
+          <w:cantSplit/>
+        </w:trPr>
+        <w:tc>
+          <w:tcPr>
+            <w:tcW w:type="dxa" w:w="1474"/>
+            <w:shd w:val="clear" w:fill="1C2430"/>
+            <w:tcBorders>
+              <w:top w:val="single" w:sz="4" w:space="0" w:color="E7DCCB"/>
+              <w:left w:val="single" w:sz="4" w:space="0" w:color="E7DCCB"/>
+              <w:bottom w:val="single" w:sz="4" w:space="0" w:color="E7DCCB"/>
+              <w:right w:val="single" w:sz="4" w:space="0" w:color="E7DCCB"/>
+            </w:tcBorders>
+            <w:tcMar>
+              <w:top w:w="60" w:type="dxa"/>
+              <w:left w:w="80" w:type="dxa"/>
+              <w:bottom w:w="60" w:type="dxa"/>
+              <w:right w:w="80" w:type="dxa"/>
+            </w:tcMar>
+            <w:vAlign w:val="center"/>
+          </w:tcPr>
+          <w:p>
+            <w:pPr>
+              <w:spacing w:before="0" w:after="0" w:line="252" w:lineRule="auto"/>
+              <w:jc w:val="left"/>
+            </w:pPr>
+            <w:r/>
+            <w:r>
+              <w:rPr>
+                <w:rFonts w:ascii="Sylfaen" w:hAnsi="Sylfaen" w:cs="Sylfaen" w:eastAsia="Sylfaen"/>
+                <w:b/>
+                <w:i w:val="0"/>
+                <w:color w:val="FFFFFF"/>
+                <w:sz w:val="22"/>
+              </w:rPr>
+              <w:t>დრო</w:t>
+            </w:r>
+          </w:p>
+        </w:tc>
+        <w:tc>
+          <w:tcPr>
+            <w:tcW w:type="dxa" w:w="2381"/>
+            <w:shd w:val="clear" w:fill="1C2430"/>
+            <w:tcBorders>
+              <w:top w:val="single" w:sz="4" w:space="0" w:color="E7DCCB"/>
+              <w:left w:val="single" w:sz="4" w:space="0" w:color="E7DCCB"/>
+              <w:bottom w:val="single" w:sz="4" w:space="0" w:color="E7DCCB"/>
+              <w:right w:val="single" w:sz="4" w:space="0" w:color="E7DCCB"/>
+            </w:tcBorders>
+            <w:tcMar>
+              <w:top w:w="60" w:type="dxa"/>
+              <w:left w:w="80" w:type="dxa"/>
+              <w:bottom w:w="60" w:type="dxa"/>
+              <w:right w:w="80" w:type="dxa"/>
+            </w:tcMar>
+            <w:vAlign w:val="center"/>
+          </w:tcPr>
+          <w:p>
+            <w:pPr>
+              <w:spacing w:before="0" w:after="0" w:line="252" w:lineRule="auto"/>
+              <w:jc w:val="left"/>
+            </w:pPr>
+            <w:r/>
+            <w:r>
+              <w:rPr>
+                <w:rFonts w:ascii="Sylfaen" w:hAnsi="Sylfaen" w:cs="Sylfaen" w:eastAsia="Sylfaen"/>
+                <w:b/>
+                <w:i w:val="0"/>
+                <w:color w:val="FFFFFF"/>
+                <w:sz w:val="22"/>
+              </w:rPr>
+              <w:t>რა</w:t>
+            </w:r>
+          </w:p>
+        </w:tc>
+        <w:tc>
+          <w:tcPr>
+            <w:tcW w:type="dxa" w:w="6123"/>
+            <w:shd w:val="clear" w:fill="1C2430"/>
+            <w:tcBorders>
+              <w:top w:val="single" w:sz="4" w:space="0" w:color="E7DCCB"/>
+              <w:left w:val="single" w:sz="4" w:space="0" w:color="E7DCCB"/>
+              <w:bottom w:val="single" w:sz="4" w:space="0" w:color="E7DCCB"/>
+              <w:right w:val="single" w:sz="4" w:space="0" w:color="E7DCCB"/>
+            </w:tcBorders>
+            <w:tcMar>
+              <w:top w:w="60" w:type="dxa"/>
+              <w:left w:w="80" w:type="dxa"/>
+              <w:bottom w:w="60" w:type="dxa"/>
+              <w:right w:w="80" w:type="dxa"/>
+            </w:tcMar>
+            <w:vAlign w:val="center"/>
+          </w:tcPr>
+          <w:p>
+            <w:pPr>
+              <w:spacing w:before="0" w:after="0" w:line="252" w:lineRule="auto"/>
+              <w:jc w:val="left"/>
+            </w:pPr>
+            <w:r/>
+            <w:r>
+              <w:rPr>
+                <w:rFonts w:ascii="Sylfaen" w:hAnsi="Sylfaen" w:cs="Sylfaen" w:eastAsia="Sylfaen"/>
+                <w:b/>
+                <w:i w:val="0"/>
+                <w:color w:val="FFFFFF"/>
+                <w:sz w:val="22"/>
+              </w:rPr>
+              <w:t>ზუსტად რას ვაკეთებთ</w:t>
+            </w:r>
+          </w:p>
+        </w:tc>
+      </w:tr>
+      <w:tr>
+        <w:trPr>
+          <w:cantSplit/>
+        </w:trPr>
+        <w:tc>
+          <w:tcPr>
+            <w:tcW w:type="dxa" w:w="1474"/>
+            <w:shd w:val="clear" w:fill="FBF6EE"/>
+            <w:tcBorders>
+              <w:top w:val="single" w:sz="4" w:space="0" w:color="E7DCCB"/>
+              <w:left w:val="single" w:sz="4" w:space="0" w:color="E7DCCB"/>
+              <w:bottom w:val="single" w:sz="4" w:space="0" w:color="E7DCCB"/>
+              <w:right w:val="single" w:sz="4" w:space="0" w:color="E7DCCB"/>
+            </w:tcBorders>
+            <w:tcMar>
+              <w:top w:w="60" w:type="dxa"/>
+              <w:left w:w="80" w:type="dxa"/>
+              <w:bottom w:w="60" w:type="dxa"/>
+              <w:right w:w="80" w:type="dxa"/>
+            </w:tcMar>
+            <w:vAlign w:val="center"/>
+          </w:tcPr>
+          <w:p>
+            <w:pPr>
+              <w:spacing w:before="0" w:after="0" w:line="252" w:lineRule="auto"/>
+              <w:jc w:val="left"/>
+            </w:pPr>
+            <w:r/>
+            <w:r>
+              <w:rPr>
+                <w:rFonts w:ascii="Sylfaen" w:hAnsi="Sylfaen" w:cs="Sylfaen" w:eastAsia="Sylfaen"/>
+                <w:b/>
+                <w:i w:val="0"/>
+                <w:color w:val="1C2430"/>
+                <w:sz w:val="21"/>
+              </w:rPr>
+              <w:t>0–3 წთ</w:t>
+            </w:r>
+          </w:p>
+        </w:tc>
+        <w:tc>
+          <w:tcPr>
+            <w:tcW w:type="dxa" w:w="2381"/>
+            <w:shd w:val="clear" w:fill="FBF6EE"/>
+            <w:tcBorders>
+              <w:top w:val="single" w:sz="4" w:space="0" w:color="E7DCCB"/>
+              <w:left w:val="single" w:sz="4" w:space="0" w:color="E7DCCB"/>
+              <w:bottom w:val="single" w:sz="4" w:space="0" w:color="E7DCCB"/>
+              <w:right w:val="single" w:sz="4" w:space="0" w:color="E7DCCB"/>
+            </w:tcBorders>
+            <w:tcMar>
+              <w:top w:w="60" w:type="dxa"/>
+              <w:left w:w="80" w:type="dxa"/>
+              <w:bottom w:w="60" w:type="dxa"/>
+              <w:right w:w="80" w:type="dxa"/>
+            </w:tcMar>
+            <w:vAlign w:val="center"/>
+          </w:tcPr>
+          <w:p>
+            <w:pPr>
+              <w:spacing w:before="0" w:after="0" w:line="252" w:lineRule="auto"/>
+              <w:jc w:val="left"/>
+            </w:pPr>
+            <w:r/>
+            <w:r>
+              <w:rPr>
+                <w:rFonts w:ascii="Sylfaen" w:hAnsi="Sylfaen" w:cs="Sylfaen" w:eastAsia="Sylfaen"/>
+                <w:b/>
+                <w:i w:val="0"/>
+                <w:color w:val="1C2430"/>
+                <w:sz w:val="21"/>
+              </w:rPr>
+              <w:t>წინარე ცოდნა</w:t>
+            </w:r>
+          </w:p>
+        </w:tc>
+        <w:tc>
+          <w:tcPr>
+            <w:tcW w:type="dxa" w:w="6123"/>
+            <w:shd w:val="clear" w:fill="FBF6EE"/>
+            <w:tcBorders>
+              <w:top w:val="single" w:sz="4" w:space="0" w:color="E7DCCB"/>
+              <w:left w:val="single" w:sz="4" w:space="0" w:color="E7DCCB"/>
+              <w:bottom w:val="single" w:sz="4" w:space="0" w:color="E7DCCB"/>
+              <w:right w:val="single" w:sz="4" w:space="0" w:color="E7DCCB"/>
+            </w:tcBorders>
+            <w:tcMar>
+              <w:top w:w="60" w:type="dxa"/>
+              <w:left w:w="80" w:type="dxa"/>
+              <w:bottom w:w="60" w:type="dxa"/>
+              <w:right w:w="80" w:type="dxa"/>
+            </w:tcMar>
+            <w:vAlign w:val="center"/>
+          </w:tcPr>
+          <w:p>
+            <w:pPr>
+              <w:spacing w:before="0" w:after="0" w:line="252" w:lineRule="auto"/>
+              <w:jc w:val="left"/>
+            </w:pPr>
+            <w:r/>
+            <w:r>
+              <w:rPr>
+                <w:rFonts w:ascii="Sylfaen" w:hAnsi="Sylfaen" w:cs="Sylfaen" w:eastAsia="Sylfaen"/>
+                <w:b w:val="0"/>
+                <w:i w:val="0"/>
+                <w:color w:val="1C2430"/>
+                <w:sz w:val="21"/>
+              </w:rPr>
+              <w:t>დაფაზე 4+4+4 და 3·4. წყვილი ამბობს, რომელი უფრო მოკლეა. ვინც ჩერდება, სამჯერ ოთხ თითს ითვლის.</w:t>
+            </w:r>
+          </w:p>
+        </w:tc>
+      </w:tr>
+      <w:tr>
+        <w:trPr>
+          <w:cantSplit/>
+        </w:trPr>
+        <w:tc>
+          <w:tcPr>
+            <w:tcW w:type="dxa" w:w="1474"/>
+            <w:shd w:val="clear" w:fill="FFFFFF"/>
+            <w:tcBorders>
+              <w:top w:val="single" w:sz="4" w:space="0" w:color="E7DCCB"/>
+              <w:left w:val="single" w:sz="4" w:space="0" w:color="E7DCCB"/>
+              <w:bottom w:val="single" w:sz="4" w:space="0" w:color="E7DCCB"/>
+              <w:right w:val="single" w:sz="4" w:space="0" w:color="E7DCCB"/>
+            </w:tcBorders>
+            <w:tcMar>
+              <w:top w:w="60" w:type="dxa"/>
+              <w:left w:w="80" w:type="dxa"/>
+              <w:bottom w:w="60" w:type="dxa"/>
+              <w:right w:w="80" w:type="dxa"/>
+            </w:tcMar>
+            <w:vAlign w:val="center"/>
+          </w:tcPr>
+          <w:p>
+            <w:pPr>
+              <w:spacing w:before="0" w:after="0" w:line="252" w:lineRule="auto"/>
+              <w:jc w:val="left"/>
+            </w:pPr>
+            <w:r/>
+            <w:r>
+              <w:rPr>
+                <w:rFonts w:ascii="Sylfaen" w:hAnsi="Sylfaen" w:cs="Sylfaen" w:eastAsia="Sylfaen"/>
+                <w:b/>
+                <w:i w:val="0"/>
+                <w:color w:val="1C2430"/>
+                <w:sz w:val="21"/>
+              </w:rPr>
+              <w:t>3–8 წთ</w:t>
+            </w:r>
+          </w:p>
+        </w:tc>
+        <w:tc>
+          <w:tcPr>
+            <w:tcW w:type="dxa" w:w="2381"/>
+            <w:shd w:val="clear" w:fill="FFFFFF"/>
+            <w:tcBorders>
+              <w:top w:val="single" w:sz="4" w:space="0" w:color="E7DCCB"/>
+              <w:left w:val="single" w:sz="4" w:space="0" w:color="E7DCCB"/>
+              <w:bottom w:val="single" w:sz="4" w:space="0" w:color="E7DCCB"/>
+              <w:right w:val="single" w:sz="4" w:space="0" w:color="E7DCCB"/>
+            </w:tcBorders>
+            <w:tcMar>
+              <w:top w:w="60" w:type="dxa"/>
+              <w:left w:w="80" w:type="dxa"/>
+              <w:bottom w:w="60" w:type="dxa"/>
+              <w:right w:w="80" w:type="dxa"/>
+            </w:tcMar>
+            <w:vAlign w:val="center"/>
+          </w:tcPr>
+          <w:p>
+            <w:pPr>
+              <w:spacing w:before="0" w:after="0" w:line="252" w:lineRule="auto"/>
+              <w:jc w:val="left"/>
+            </w:pPr>
+            <w:r/>
+            <w:r>
+              <w:rPr>
+                <w:rFonts w:ascii="Sylfaen" w:hAnsi="Sylfaen" w:cs="Sylfaen" w:eastAsia="Sylfaen"/>
+                <w:b/>
+                <w:i w:val="0"/>
+                <w:color w:val="1C2430"/>
+                <w:sz w:val="21"/>
+              </w:rPr>
+              <w:t>რვეულები</w:t>
+            </w:r>
+          </w:p>
+        </w:tc>
+        <w:tc>
+          <w:tcPr>
+            <w:tcW w:type="dxa" w:w="6123"/>
+            <w:shd w:val="clear" w:fill="FFFFFF"/>
+            <w:tcBorders>
+              <w:top w:val="single" w:sz="4" w:space="0" w:color="E7DCCB"/>
+              <w:left w:val="single" w:sz="4" w:space="0" w:color="E7DCCB"/>
+              <w:bottom w:val="single" w:sz="4" w:space="0" w:color="E7DCCB"/>
+              <w:right w:val="single" w:sz="4" w:space="0" w:color="E7DCCB"/>
+            </w:tcBorders>
+            <w:tcMar>
+              <w:top w:w="60" w:type="dxa"/>
+              <w:left w:w="80" w:type="dxa"/>
+              <w:bottom w:w="60" w:type="dxa"/>
+              <w:right w:w="80" w:type="dxa"/>
+            </w:tcMar>
+            <w:vAlign w:val="center"/>
+          </w:tcPr>
+          <w:p>
+            <w:pPr>
+              <w:spacing w:before="0" w:after="0" w:line="252" w:lineRule="auto"/>
+              <w:jc w:val="left"/>
+            </w:pPr>
+            <w:r/>
+            <w:r>
+              <w:rPr>
+                <w:rFonts w:ascii="Sylfaen" w:hAnsi="Sylfaen" w:cs="Sylfaen" w:eastAsia="Sylfaen"/>
+                <w:b w:val="0"/>
+                <w:i w:val="0"/>
+                <w:color w:val="1C2430"/>
+                <w:sz w:val="21"/>
+              </w:rPr>
+              <w:t>კითხვა: „ხუთი მოსწავლიდან თითოეულს 6 რვეული აქვს. სულ რამდენი რვეულია?“ ორი გზა, ორივე 30. ერთი მოსწავლე ასახელებს მამრავლსა და ნამრავლს.</w:t>
+            </w:r>
+          </w:p>
+        </w:tc>
+      </w:tr>
+      <w:tr>
+        <w:trPr>
+          <w:cantSplit/>
+        </w:trPr>
+        <w:tc>
+          <w:tcPr>
+            <w:tcW w:type="dxa" w:w="1474"/>
+            <w:shd w:val="clear" w:fill="FBF6EE"/>
+            <w:tcBorders>
+              <w:top w:val="single" w:sz="4" w:space="0" w:color="E7DCCB"/>
+              <w:left w:val="single" w:sz="4" w:space="0" w:color="E7DCCB"/>
+              <w:bottom w:val="single" w:sz="4" w:space="0" w:color="E7DCCB"/>
+              <w:right w:val="single" w:sz="4" w:space="0" w:color="E7DCCB"/>
+            </w:tcBorders>
+            <w:tcMar>
+              <w:top w:w="60" w:type="dxa"/>
+              <w:left w:w="80" w:type="dxa"/>
+              <w:bottom w:w="60" w:type="dxa"/>
+              <w:right w:w="80" w:type="dxa"/>
+            </w:tcMar>
+            <w:vAlign w:val="center"/>
+          </w:tcPr>
+          <w:p>
+            <w:pPr>
+              <w:spacing w:before="0" w:after="0" w:line="252" w:lineRule="auto"/>
+              <w:jc w:val="left"/>
+            </w:pPr>
+            <w:r/>
+            <w:r>
+              <w:rPr>
+                <w:rFonts w:ascii="Sylfaen" w:hAnsi="Sylfaen" w:cs="Sylfaen" w:eastAsia="Sylfaen"/>
+                <w:b/>
+                <w:i w:val="0"/>
+                <w:color w:val="1C2430"/>
+                <w:sz w:val="21"/>
+              </w:rPr>
+              <w:t>8–12 წთ</w:t>
+            </w:r>
+          </w:p>
+        </w:tc>
+        <w:tc>
+          <w:tcPr>
+            <w:tcW w:type="dxa" w:w="2381"/>
+            <w:shd w:val="clear" w:fill="FBF6EE"/>
+            <w:tcBorders>
+              <w:top w:val="single" w:sz="4" w:space="0" w:color="E7DCCB"/>
+              <w:left w:val="single" w:sz="4" w:space="0" w:color="E7DCCB"/>
+              <w:bottom w:val="single" w:sz="4" w:space="0" w:color="E7DCCB"/>
+              <w:right w:val="single" w:sz="4" w:space="0" w:color="E7DCCB"/>
+            </w:tcBorders>
+            <w:tcMar>
+              <w:top w:w="60" w:type="dxa"/>
+              <w:left w:w="80" w:type="dxa"/>
+              <w:bottom w:w="60" w:type="dxa"/>
+              <w:right w:w="80" w:type="dxa"/>
+            </w:tcMar>
+            <w:vAlign w:val="center"/>
+          </w:tcPr>
+          <w:p>
+            <w:pPr>
+              <w:spacing w:before="0" w:after="0" w:line="252" w:lineRule="auto"/>
+              <w:jc w:val="left"/>
+            </w:pPr>
+            <w:r/>
+            <w:r>
+              <w:rPr>
+                <w:rFonts w:ascii="Sylfaen" w:hAnsi="Sylfaen" w:cs="Sylfaen" w:eastAsia="Sylfaen"/>
+                <w:b/>
+                <w:i w:val="0"/>
+                <w:color w:val="1C2430"/>
+                <w:sz w:val="21"/>
+              </w:rPr>
+              <w:t>გადანაცვლებადობა</w:t>
+            </w:r>
+          </w:p>
+        </w:tc>
+        <w:tc>
+          <w:tcPr>
+            <w:tcW w:type="dxa" w:w="6123"/>
+            <w:shd w:val="clear" w:fill="FBF6EE"/>
+            <w:tcBorders>
+              <w:top w:val="single" w:sz="4" w:space="0" w:color="E7DCCB"/>
+              <w:left w:val="single" w:sz="4" w:space="0" w:color="E7DCCB"/>
+              <w:bottom w:val="single" w:sz="4" w:space="0" w:color="E7DCCB"/>
+              <w:right w:val="single" w:sz="4" w:space="0" w:color="E7DCCB"/>
+            </w:tcBorders>
+            <w:tcMar>
+              <w:top w:w="60" w:type="dxa"/>
+              <w:left w:w="80" w:type="dxa"/>
+              <w:bottom w:w="60" w:type="dxa"/>
+              <w:right w:w="80" w:type="dxa"/>
+            </w:tcMar>
+            <w:vAlign w:val="center"/>
+          </w:tcPr>
+          <w:p>
+            <w:pPr>
+              <w:spacing w:before="0" w:after="0" w:line="252" w:lineRule="auto"/>
+              <w:jc w:val="left"/>
+            </w:pPr>
+            <w:r/>
+            <w:r>
+              <w:rPr>
+                <w:rFonts w:ascii="Sylfaen" w:hAnsi="Sylfaen" w:cs="Sylfaen" w:eastAsia="Sylfaen"/>
+                <w:b w:val="0"/>
+                <w:i w:val="0"/>
+                <w:color w:val="1C2430"/>
+                <w:sz w:val="21"/>
+              </w:rPr>
+              <w:t>6·5 და 5·6. წყვილი ამბობს, რა არ შეიცვალა. მერე სახელი: გადანაცვლებადობის თვისება, a·b=b·a.</w:t>
+            </w:r>
+          </w:p>
+        </w:tc>
+      </w:tr>
+      <w:tr>
+        <w:trPr>
+          <w:cantSplit/>
+        </w:trPr>
+        <w:tc>
+          <w:tcPr>
+            <w:tcW w:type="dxa" w:w="1474"/>
+            <w:shd w:val="clear" w:fill="FFFFFF"/>
+            <w:tcBorders>
+              <w:top w:val="single" w:sz="4" w:space="0" w:color="E7DCCB"/>
+              <w:left w:val="single" w:sz="4" w:space="0" w:color="E7DCCB"/>
+              <w:bottom w:val="single" w:sz="4" w:space="0" w:color="E7DCCB"/>
+              <w:right w:val="single" w:sz="4" w:space="0" w:color="E7DCCB"/>
+            </w:tcBorders>
+            <w:tcMar>
+              <w:top w:w="60" w:type="dxa"/>
+              <w:left w:w="80" w:type="dxa"/>
+              <w:bottom w:w="60" w:type="dxa"/>
+              <w:right w:w="80" w:type="dxa"/>
+            </w:tcMar>
+            <w:vAlign w:val="center"/>
+          </w:tcPr>
+          <w:p>
+            <w:pPr>
+              <w:spacing w:before="0" w:after="0" w:line="252" w:lineRule="auto"/>
+              <w:jc w:val="left"/>
+            </w:pPr>
+            <w:r/>
+            <w:r>
+              <w:rPr>
+                <w:rFonts w:ascii="Sylfaen" w:hAnsi="Sylfaen" w:cs="Sylfaen" w:eastAsia="Sylfaen"/>
+                <w:b/>
+                <w:i w:val="0"/>
+                <w:color w:val="1C2430"/>
+                <w:sz w:val="21"/>
+              </w:rPr>
+              <w:t>12–15 წთ</w:t>
+            </w:r>
+          </w:p>
+        </w:tc>
+        <w:tc>
+          <w:tcPr>
+            <w:tcW w:type="dxa" w:w="2381"/>
+            <w:shd w:val="clear" w:fill="FFFFFF"/>
+            <w:tcBorders>
+              <w:top w:val="single" w:sz="4" w:space="0" w:color="E7DCCB"/>
+              <w:left w:val="single" w:sz="4" w:space="0" w:color="E7DCCB"/>
+              <w:bottom w:val="single" w:sz="4" w:space="0" w:color="E7DCCB"/>
+              <w:right w:val="single" w:sz="4" w:space="0" w:color="E7DCCB"/>
+            </w:tcBorders>
+            <w:tcMar>
+              <w:top w:w="60" w:type="dxa"/>
+              <w:left w:w="80" w:type="dxa"/>
+              <w:bottom w:w="60" w:type="dxa"/>
+              <w:right w:w="80" w:type="dxa"/>
+            </w:tcMar>
+            <w:vAlign w:val="center"/>
+          </w:tcPr>
+          <w:p>
+            <w:pPr>
+              <w:spacing w:before="0" w:after="0" w:line="252" w:lineRule="auto"/>
+              <w:jc w:val="left"/>
+            </w:pPr>
+            <w:r/>
+            <w:r>
+              <w:rPr>
+                <w:rFonts w:ascii="Sylfaen" w:hAnsi="Sylfaen" w:cs="Sylfaen" w:eastAsia="Sylfaen"/>
+                <w:b/>
+                <w:i w:val="0"/>
+                <w:color w:val="1C2430"/>
+                <w:sz w:val="21"/>
+              </w:rPr>
+              <w:t>ერთი და ნული</w:t>
+            </w:r>
+          </w:p>
+        </w:tc>
+        <w:tc>
+          <w:tcPr>
+            <w:tcW w:type="dxa" w:w="6123"/>
+            <w:shd w:val="clear" w:fill="FFFFFF"/>
+            <w:tcBorders>
+              <w:top w:val="single" w:sz="4" w:space="0" w:color="E7DCCB"/>
+              <w:left w:val="single" w:sz="4" w:space="0" w:color="E7DCCB"/>
+              <w:bottom w:val="single" w:sz="4" w:space="0" w:color="E7DCCB"/>
+              <w:right w:val="single" w:sz="4" w:space="0" w:color="E7DCCB"/>
+            </w:tcBorders>
+            <w:tcMar>
+              <w:top w:w="60" w:type="dxa"/>
+              <w:left w:w="80" w:type="dxa"/>
+              <w:bottom w:w="60" w:type="dxa"/>
+              <w:right w:w="80" w:type="dxa"/>
+            </w:tcMar>
+            <w:vAlign w:val="center"/>
+          </w:tcPr>
+          <w:p>
+            <w:pPr>
+              <w:spacing w:before="0" w:after="0" w:line="252" w:lineRule="auto"/>
+              <w:jc w:val="left"/>
+            </w:pPr>
+            <w:r/>
+            <w:r>
+              <w:rPr>
+                <w:rFonts w:ascii="Sylfaen" w:hAnsi="Sylfaen" w:cs="Sylfaen" w:eastAsia="Sylfaen"/>
+                <w:b w:val="0"/>
+                <w:i w:val="0"/>
+                <w:color w:val="1C2430"/>
+                <w:sz w:val="21"/>
+              </w:rPr>
+              <w:t>7·1=7 და 7·0=0. კლასი ამბობს: ერთზე გამრავლება რიცხვს არ ცვლის. 0·a=0. ეს სამ თვისებაში არ შედის.</w:t>
+            </w:r>
+          </w:p>
+        </w:tc>
+      </w:tr>
+      <w:tr>
+        <w:trPr>
+          <w:cantSplit/>
+        </w:trPr>
+        <w:tc>
+          <w:tcPr>
+            <w:tcW w:type="dxa" w:w="1474"/>
+            <w:shd w:val="clear" w:fill="FBF6EE"/>
+            <w:tcBorders>
+              <w:top w:val="single" w:sz="4" w:space="0" w:color="E7DCCB"/>
+              <w:left w:val="single" w:sz="4" w:space="0" w:color="E7DCCB"/>
+              <w:bottom w:val="single" w:sz="4" w:space="0" w:color="E7DCCB"/>
+              <w:right w:val="single" w:sz="4" w:space="0" w:color="E7DCCB"/>
+            </w:tcBorders>
+            <w:tcMar>
+              <w:top w:w="60" w:type="dxa"/>
+              <w:left w:w="80" w:type="dxa"/>
+              <w:bottom w:w="60" w:type="dxa"/>
+              <w:right w:w="80" w:type="dxa"/>
+            </w:tcMar>
+            <w:vAlign w:val="center"/>
+          </w:tcPr>
+          <w:p>
+            <w:pPr>
+              <w:spacing w:before="0" w:after="0" w:line="252" w:lineRule="auto"/>
+              <w:jc w:val="left"/>
+            </w:pPr>
+            <w:r/>
+            <w:r>
+              <w:rPr>
+                <w:rFonts w:ascii="Sylfaen" w:hAnsi="Sylfaen" w:cs="Sylfaen" w:eastAsia="Sylfaen"/>
+                <w:b/>
+                <w:i w:val="0"/>
+                <w:color w:val="1C2430"/>
+                <w:sz w:val="21"/>
+              </w:rPr>
+              <w:t>15–19 წთ</w:t>
+            </w:r>
+          </w:p>
+        </w:tc>
+        <w:tc>
+          <w:tcPr>
+            <w:tcW w:type="dxa" w:w="2381"/>
+            <w:shd w:val="clear" w:fill="FBF6EE"/>
+            <w:tcBorders>
+              <w:top w:val="single" w:sz="4" w:space="0" w:color="E7DCCB"/>
+              <w:left w:val="single" w:sz="4" w:space="0" w:color="E7DCCB"/>
+              <w:bottom w:val="single" w:sz="4" w:space="0" w:color="E7DCCB"/>
+              <w:right w:val="single" w:sz="4" w:space="0" w:color="E7DCCB"/>
+            </w:tcBorders>
+            <w:tcMar>
+              <w:top w:w="60" w:type="dxa"/>
+              <w:left w:w="80" w:type="dxa"/>
+              <w:bottom w:w="60" w:type="dxa"/>
+              <w:right w:w="80" w:type="dxa"/>
+            </w:tcMar>
+            <w:vAlign w:val="center"/>
+          </w:tcPr>
+          <w:p>
+            <w:pPr>
+              <w:spacing w:before="0" w:after="0" w:line="252" w:lineRule="auto"/>
+              <w:jc w:val="left"/>
+            </w:pPr>
+            <w:r/>
+            <w:r>
+              <w:rPr>
+                <w:rFonts w:ascii="Sylfaen" w:hAnsi="Sylfaen" w:cs="Sylfaen" w:eastAsia="Sylfaen"/>
+                <w:b/>
+                <w:i w:val="0"/>
+                <w:color w:val="1C2430"/>
+                <w:sz w:val="21"/>
+              </w:rPr>
+              <w:t>ჯუფთებადობა</w:t>
+            </w:r>
+          </w:p>
+        </w:tc>
+        <w:tc>
+          <w:tcPr>
+            <w:tcW w:type="dxa" w:w="6123"/>
+            <w:shd w:val="clear" w:fill="FBF6EE"/>
+            <w:tcBorders>
+              <w:top w:val="single" w:sz="4" w:space="0" w:color="E7DCCB"/>
+              <w:left w:val="single" w:sz="4" w:space="0" w:color="E7DCCB"/>
+              <w:bottom w:val="single" w:sz="4" w:space="0" w:color="E7DCCB"/>
+              <w:right w:val="single" w:sz="4" w:space="0" w:color="E7DCCB"/>
+            </w:tcBorders>
+            <w:tcMar>
+              <w:top w:w="60" w:type="dxa"/>
+              <w:left w:w="80" w:type="dxa"/>
+              <w:bottom w:w="60" w:type="dxa"/>
+              <w:right w:w="80" w:type="dxa"/>
+            </w:tcMar>
+            <w:vAlign w:val="center"/>
+          </w:tcPr>
+          <w:p>
+            <w:pPr>
+              <w:spacing w:before="0" w:after="0" w:line="252" w:lineRule="auto"/>
+              <w:jc w:val="left"/>
+            </w:pPr>
+            <w:r/>
+            <w:r>
+              <w:rPr>
+                <w:rFonts w:ascii="Sylfaen" w:hAnsi="Sylfaen" w:cs="Sylfaen" w:eastAsia="Sylfaen"/>
+                <w:b w:val="0"/>
+                <w:i w:val="0"/>
+                <w:color w:val="1C2430"/>
+                <w:sz w:val="21"/>
+              </w:rPr>
+              <w:t>(3·4)·5 და 3·(4·5), ორივე 60. სახელი: ჯუფთებადობის თვისება, (a·b)·c=a·(b·c).</w:t>
+            </w:r>
+          </w:p>
+        </w:tc>
+      </w:tr>
+      <w:tr>
+        <w:trPr>
+          <w:cantSplit/>
+        </w:trPr>
+        <w:tc>
+          <w:tcPr>
+            <w:tcW w:type="dxa" w:w="1474"/>
+            <w:shd w:val="clear" w:fill="FFFFFF"/>
+            <w:tcBorders>
+              <w:top w:val="single" w:sz="4" w:space="0" w:color="E7DCCB"/>
+              <w:left w:val="single" w:sz="4" w:space="0" w:color="E7DCCB"/>
+              <w:bottom w:val="single" w:sz="4" w:space="0" w:color="E7DCCB"/>
+              <w:right w:val="single" w:sz="4" w:space="0" w:color="E7DCCB"/>
+            </w:tcBorders>
+            <w:tcMar>
+              <w:top w:w="60" w:type="dxa"/>
+              <w:left w:w="80" w:type="dxa"/>
+              <w:bottom w:w="60" w:type="dxa"/>
+              <w:right w:w="80" w:type="dxa"/>
+            </w:tcMar>
+            <w:vAlign w:val="center"/>
+          </w:tcPr>
+          <w:p>
+            <w:pPr>
+              <w:spacing w:before="0" w:after="0" w:line="252" w:lineRule="auto"/>
+              <w:jc w:val="left"/>
+            </w:pPr>
+            <w:r/>
+            <w:r>
+              <w:rPr>
+                <w:rFonts w:ascii="Sylfaen" w:hAnsi="Sylfaen" w:cs="Sylfaen" w:eastAsia="Sylfaen"/>
+                <w:b/>
+                <w:i w:val="0"/>
+                <w:color w:val="1C2430"/>
+                <w:sz w:val="21"/>
+              </w:rPr>
+              <w:t>19–25 წთ</w:t>
+            </w:r>
+          </w:p>
+        </w:tc>
+        <w:tc>
+          <w:tcPr>
+            <w:tcW w:type="dxa" w:w="2381"/>
+            <w:shd w:val="clear" w:fill="FFFFFF"/>
+            <w:tcBorders>
+              <w:top w:val="single" w:sz="4" w:space="0" w:color="E7DCCB"/>
+              <w:left w:val="single" w:sz="4" w:space="0" w:color="E7DCCB"/>
+              <w:bottom w:val="single" w:sz="4" w:space="0" w:color="E7DCCB"/>
+              <w:right w:val="single" w:sz="4" w:space="0" w:color="E7DCCB"/>
+            </w:tcBorders>
+            <w:tcMar>
+              <w:top w:w="60" w:type="dxa"/>
+              <w:left w:w="80" w:type="dxa"/>
+              <w:bottom w:w="60" w:type="dxa"/>
+              <w:right w:w="80" w:type="dxa"/>
+            </w:tcMar>
+            <w:vAlign w:val="center"/>
+          </w:tcPr>
+          <w:p>
+            <w:pPr>
+              <w:spacing w:before="0" w:after="0" w:line="252" w:lineRule="auto"/>
+              <w:jc w:val="left"/>
+            </w:pPr>
+            <w:r/>
+            <w:r>
+              <w:rPr>
+                <w:rFonts w:ascii="Sylfaen" w:hAnsi="Sylfaen" w:cs="Sylfaen" w:eastAsia="Sylfaen"/>
+                <w:b/>
+                <w:i w:val="0"/>
+                <w:color w:val="1C2430"/>
+                <w:sz w:val="21"/>
+              </w:rPr>
+              <w:t>განრიგებადობა</w:t>
+            </w:r>
+          </w:p>
+        </w:tc>
+        <w:tc>
+          <w:tcPr>
+            <w:tcW w:type="dxa" w:w="6123"/>
+            <w:shd w:val="clear" w:fill="FFFFFF"/>
+            <w:tcBorders>
+              <w:top w:val="single" w:sz="4" w:space="0" w:color="E7DCCB"/>
+              <w:left w:val="single" w:sz="4" w:space="0" w:color="E7DCCB"/>
+              <w:bottom w:val="single" w:sz="4" w:space="0" w:color="E7DCCB"/>
+              <w:right w:val="single" w:sz="4" w:space="0" w:color="E7DCCB"/>
+            </w:tcBorders>
+            <w:tcMar>
+              <w:top w:w="60" w:type="dxa"/>
+              <w:left w:w="80" w:type="dxa"/>
+              <w:bottom w:w="60" w:type="dxa"/>
+              <w:right w:w="80" w:type="dxa"/>
+            </w:tcMar>
+            <w:vAlign w:val="center"/>
+          </w:tcPr>
+          <w:p>
+            <w:pPr>
+              <w:spacing w:before="0" w:after="0" w:line="252" w:lineRule="auto"/>
+              <w:jc w:val="left"/>
+            </w:pPr>
+            <w:r/>
+            <w:r>
+              <w:rPr>
+                <w:rFonts w:ascii="Sylfaen" w:hAnsi="Sylfaen" w:cs="Sylfaen" w:eastAsia="Sylfaen"/>
+                <w:b w:val="0"/>
+                <w:i w:val="0"/>
+                <w:color w:val="1C2430"/>
+                <w:sz w:val="21"/>
+              </w:rPr>
+              <w:t>ხუთ ყუთში თითოში 9 და 4 რვეული. ორი გზა, ორივე 65. სახელი: განრიგებადობის თვისება. a(b+c)=ab+ac და (b+c)·a=ba+ca.</w:t>
+            </w:r>
+          </w:p>
+        </w:tc>
+      </w:tr>
+      <w:tr>
+        <w:trPr>
+          <w:cantSplit/>
+        </w:trPr>
+        <w:tc>
+          <w:tcPr>
+            <w:tcW w:type="dxa" w:w="1474"/>
+            <w:shd w:val="clear" w:fill="FBF6EE"/>
+            <w:tcBorders>
+              <w:top w:val="single" w:sz="4" w:space="0" w:color="E7DCCB"/>
+              <w:left w:val="single" w:sz="4" w:space="0" w:color="E7DCCB"/>
+              <w:bottom w:val="single" w:sz="4" w:space="0" w:color="E7DCCB"/>
+              <w:right w:val="single" w:sz="4" w:space="0" w:color="E7DCCB"/>
+            </w:tcBorders>
+            <w:tcMar>
+              <w:top w:w="60" w:type="dxa"/>
+              <w:left w:w="80" w:type="dxa"/>
+              <w:bottom w:w="60" w:type="dxa"/>
+              <w:right w:w="80" w:type="dxa"/>
+            </w:tcMar>
+            <w:vAlign w:val="center"/>
+          </w:tcPr>
+          <w:p>
+            <w:pPr>
+              <w:spacing w:before="0" w:after="0" w:line="252" w:lineRule="auto"/>
+              <w:jc w:val="left"/>
+            </w:pPr>
+            <w:r/>
+            <w:r>
+              <w:rPr>
+                <w:rFonts w:ascii="Sylfaen" w:hAnsi="Sylfaen" w:cs="Sylfaen" w:eastAsia="Sylfaen"/>
+                <w:b/>
+                <w:i w:val="0"/>
+                <w:color w:val="1C2430"/>
+                <w:sz w:val="21"/>
+              </w:rPr>
+              <w:t>25–28 წთ</w:t>
+            </w:r>
+          </w:p>
+        </w:tc>
+        <w:tc>
+          <w:tcPr>
+            <w:tcW w:type="dxa" w:w="2381"/>
+            <w:shd w:val="clear" w:fill="FBF6EE"/>
+            <w:tcBorders>
+              <w:top w:val="single" w:sz="4" w:space="0" w:color="E7DCCB"/>
+              <w:left w:val="single" w:sz="4" w:space="0" w:color="E7DCCB"/>
+              <w:bottom w:val="single" w:sz="4" w:space="0" w:color="E7DCCB"/>
+              <w:right w:val="single" w:sz="4" w:space="0" w:color="E7DCCB"/>
+            </w:tcBorders>
+            <w:tcMar>
+              <w:top w:w="60" w:type="dxa"/>
+              <w:left w:w="80" w:type="dxa"/>
+              <w:bottom w:w="60" w:type="dxa"/>
+              <w:right w:w="80" w:type="dxa"/>
+            </w:tcMar>
+            <w:vAlign w:val="center"/>
+          </w:tcPr>
+          <w:p>
+            <w:pPr>
+              <w:spacing w:before="0" w:after="0" w:line="252" w:lineRule="auto"/>
+              <w:jc w:val="left"/>
+            </w:pPr>
+            <w:r/>
+            <w:r>
+              <w:rPr>
+                <w:rFonts w:ascii="Sylfaen" w:hAnsi="Sylfaen" w:cs="Sylfaen" w:eastAsia="Sylfaen"/>
+                <w:b/>
+                <w:i w:val="0"/>
+                <w:color w:val="1C2430"/>
+                <w:sz w:val="21"/>
+              </w:rPr>
+              <w:t>საერთო მამრავლი</w:t>
+            </w:r>
+          </w:p>
+        </w:tc>
+        <w:tc>
+          <w:tcPr>
+            <w:tcW w:type="dxa" w:w="6123"/>
+            <w:shd w:val="clear" w:fill="FBF6EE"/>
+            <w:tcBorders>
+              <w:top w:val="single" w:sz="4" w:space="0" w:color="E7DCCB"/>
+              <w:left w:val="single" w:sz="4" w:space="0" w:color="E7DCCB"/>
+              <w:bottom w:val="single" w:sz="4" w:space="0" w:color="E7DCCB"/>
+              <w:right w:val="single" w:sz="4" w:space="0" w:color="E7DCCB"/>
+            </w:tcBorders>
+            <w:tcMar>
+              <w:top w:w="60" w:type="dxa"/>
+              <w:left w:w="80" w:type="dxa"/>
+              <w:bottom w:w="60" w:type="dxa"/>
+              <w:right w:w="80" w:type="dxa"/>
+            </w:tcMar>
+            <w:vAlign w:val="center"/>
+          </w:tcPr>
+          <w:p>
+            <w:pPr>
+              <w:spacing w:before="0" w:after="0" w:line="252" w:lineRule="auto"/>
+              <w:jc w:val="left"/>
+            </w:pPr>
+            <w:r/>
+            <w:r>
+              <w:rPr>
+                <w:rFonts w:ascii="Sylfaen" w:hAnsi="Sylfaen" w:cs="Sylfaen" w:eastAsia="Sylfaen"/>
+                <w:b w:val="0"/>
+                <w:i w:val="0"/>
+                <w:color w:val="1C2430"/>
+                <w:sz w:val="21"/>
+              </w:rPr>
+              <w:t>უკვე ნანახი 5·9+5·4=5·(9+4)-დან წერენ 9a+7a=(9+7)a=16a. მეორე წყვილი: 4a+5a=9a.</w:t>
+            </w:r>
+          </w:p>
+        </w:tc>
+      </w:tr>
+      <w:tr>
+        <w:trPr>
+          <w:cantSplit/>
+        </w:trPr>
+        <w:tc>
+          <w:tcPr>
+            <w:tcW w:type="dxa" w:w="1474"/>
+            <w:shd w:val="clear" w:fill="FFFFFF"/>
+            <w:tcBorders>
+              <w:top w:val="single" w:sz="4" w:space="0" w:color="E7DCCB"/>
+              <w:left w:val="single" w:sz="4" w:space="0" w:color="E7DCCB"/>
+              <w:bottom w:val="single" w:sz="4" w:space="0" w:color="E7DCCB"/>
+              <w:right w:val="single" w:sz="4" w:space="0" w:color="E7DCCB"/>
+            </w:tcBorders>
+            <w:tcMar>
+              <w:top w:w="60" w:type="dxa"/>
+              <w:left w:w="80" w:type="dxa"/>
+              <w:bottom w:w="60" w:type="dxa"/>
+              <w:right w:w="80" w:type="dxa"/>
+            </w:tcMar>
+            <w:vAlign w:val="center"/>
+          </w:tcPr>
+          <w:p>
+            <w:pPr>
+              <w:spacing w:before="0" w:after="0" w:line="252" w:lineRule="auto"/>
+              <w:jc w:val="left"/>
+            </w:pPr>
+            <w:r/>
+            <w:r>
+              <w:rPr>
+                <w:rFonts w:ascii="Sylfaen" w:hAnsi="Sylfaen" w:cs="Sylfaen" w:eastAsia="Sylfaen"/>
+                <w:b/>
+                <w:i w:val="0"/>
+                <w:color w:val="1C2430"/>
+                <w:sz w:val="21"/>
+              </w:rPr>
+              <w:t>28–32 წთ</w:t>
+            </w:r>
+          </w:p>
+        </w:tc>
+        <w:tc>
+          <w:tcPr>
+            <w:tcW w:type="dxa" w:w="2381"/>
+            <w:shd w:val="clear" w:fill="FFFFFF"/>
+            <w:tcBorders>
+              <w:top w:val="single" w:sz="4" w:space="0" w:color="E7DCCB"/>
+              <w:left w:val="single" w:sz="4" w:space="0" w:color="E7DCCB"/>
+              <w:bottom w:val="single" w:sz="4" w:space="0" w:color="E7DCCB"/>
+              <w:right w:val="single" w:sz="4" w:space="0" w:color="E7DCCB"/>
+            </w:tcBorders>
+            <w:tcMar>
+              <w:top w:w="60" w:type="dxa"/>
+              <w:left w:w="80" w:type="dxa"/>
+              <w:bottom w:w="60" w:type="dxa"/>
+              <w:right w:w="80" w:type="dxa"/>
+            </w:tcMar>
+            <w:vAlign w:val="center"/>
+          </w:tcPr>
+          <w:p>
+            <w:pPr>
+              <w:spacing w:before="0" w:after="0" w:line="252" w:lineRule="auto"/>
+              <w:jc w:val="left"/>
+            </w:pPr>
+            <w:r/>
+            <w:r>
+              <w:rPr>
+                <w:rFonts w:ascii="Sylfaen" w:hAnsi="Sylfaen" w:cs="Sylfaen" w:eastAsia="Sylfaen"/>
+                <w:b/>
+                <w:i w:val="0"/>
+                <w:color w:val="1C2430"/>
+                <w:sz w:val="21"/>
+              </w:rPr>
+              <w:t>ასოთი</w:t>
+            </w:r>
+          </w:p>
+        </w:tc>
+        <w:tc>
+          <w:tcPr>
+            <w:tcW w:type="dxa" w:w="6123"/>
+            <w:shd w:val="clear" w:fill="FFFFFF"/>
+            <w:tcBorders>
+              <w:top w:val="single" w:sz="4" w:space="0" w:color="E7DCCB"/>
+              <w:left w:val="single" w:sz="4" w:space="0" w:color="E7DCCB"/>
+              <w:bottom w:val="single" w:sz="4" w:space="0" w:color="E7DCCB"/>
+              <w:right w:val="single" w:sz="4" w:space="0" w:color="E7DCCB"/>
+            </w:tcBorders>
+            <w:tcMar>
+              <w:top w:w="60" w:type="dxa"/>
+              <w:left w:w="80" w:type="dxa"/>
+              <w:bottom w:w="60" w:type="dxa"/>
+              <w:right w:w="80" w:type="dxa"/>
+            </w:tcMar>
+            <w:vAlign w:val="center"/>
+          </w:tcPr>
+          <w:p>
+            <w:pPr>
+              <w:spacing w:before="0" w:after="0" w:line="252" w:lineRule="auto"/>
+              <w:jc w:val="left"/>
+            </w:pPr>
+            <w:r/>
+            <w:r>
+              <w:rPr>
+                <w:rFonts w:ascii="Sylfaen" w:hAnsi="Sylfaen" w:cs="Sylfaen" w:eastAsia="Sylfaen"/>
+                <w:b w:val="0"/>
+                <w:i w:val="0"/>
+                <w:color w:val="1C2430"/>
+                <w:sz w:val="21"/>
+              </w:rPr>
+              <w:t>8a და a·8. 7(a+c) და (a+c)·7. 9a+7a.</w:t>
+            </w:r>
+          </w:p>
+        </w:tc>
+      </w:tr>
+      <w:tr>
+        <w:trPr>
+          <w:cantSplit/>
+        </w:trPr>
+        <w:tc>
+          <w:tcPr>
+            <w:tcW w:type="dxa" w:w="1474"/>
+            <w:shd w:val="clear" w:fill="FBF6EE"/>
+            <w:tcBorders>
+              <w:top w:val="single" w:sz="4" w:space="0" w:color="E7DCCB"/>
+              <w:left w:val="single" w:sz="4" w:space="0" w:color="E7DCCB"/>
+              <w:bottom w:val="single" w:sz="4" w:space="0" w:color="E7DCCB"/>
+              <w:right w:val="single" w:sz="4" w:space="0" w:color="E7DCCB"/>
+            </w:tcBorders>
+            <w:tcMar>
+              <w:top w:w="60" w:type="dxa"/>
+              <w:left w:w="80" w:type="dxa"/>
+              <w:bottom w:w="60" w:type="dxa"/>
+              <w:right w:w="80" w:type="dxa"/>
+            </w:tcMar>
+            <w:vAlign w:val="center"/>
+          </w:tcPr>
+          <w:p>
+            <w:pPr>
+              <w:spacing w:before="0" w:after="0" w:line="252" w:lineRule="auto"/>
+              <w:jc w:val="left"/>
+            </w:pPr>
+            <w:r/>
+            <w:r>
+              <w:rPr>
+                <w:rFonts w:ascii="Sylfaen" w:hAnsi="Sylfaen" w:cs="Sylfaen" w:eastAsia="Sylfaen"/>
+                <w:b/>
+                <w:i w:val="0"/>
+                <w:color w:val="1C2430"/>
+                <w:sz w:val="21"/>
+              </w:rPr>
+              <w:t>32–36 წთ</w:t>
+            </w:r>
+          </w:p>
+        </w:tc>
+        <w:tc>
+          <w:tcPr>
+            <w:tcW w:type="dxa" w:w="2381"/>
+            <w:shd w:val="clear" w:fill="FBF6EE"/>
+            <w:tcBorders>
+              <w:top w:val="single" w:sz="4" w:space="0" w:color="E7DCCB"/>
+              <w:left w:val="single" w:sz="4" w:space="0" w:color="E7DCCB"/>
+              <w:bottom w:val="single" w:sz="4" w:space="0" w:color="E7DCCB"/>
+              <w:right w:val="single" w:sz="4" w:space="0" w:color="E7DCCB"/>
+            </w:tcBorders>
+            <w:tcMar>
+              <w:top w:w="60" w:type="dxa"/>
+              <w:left w:w="80" w:type="dxa"/>
+              <w:bottom w:w="60" w:type="dxa"/>
+              <w:right w:w="80" w:type="dxa"/>
+            </w:tcMar>
+            <w:vAlign w:val="center"/>
+          </w:tcPr>
+          <w:p>
+            <w:pPr>
+              <w:spacing w:before="0" w:after="0" w:line="252" w:lineRule="auto"/>
+              <w:jc w:val="left"/>
+            </w:pPr>
+            <w:r/>
+            <w:r>
+              <w:rPr>
+                <w:rFonts w:ascii="Sylfaen" w:hAnsi="Sylfaen" w:cs="Sylfaen" w:eastAsia="Sylfaen"/>
+                <w:b/>
+                <w:i w:val="0"/>
+                <w:color w:val="1C2430"/>
+                <w:sz w:val="21"/>
+              </w:rPr>
+              <w:t>სამი ჩანაწერი, რვეული</w:t>
+            </w:r>
+          </w:p>
+        </w:tc>
+        <w:tc>
+          <w:tcPr>
+            <w:tcW w:type="dxa" w:w="6123"/>
+            <w:shd w:val="clear" w:fill="FBF6EE"/>
+            <w:tcBorders>
+              <w:top w:val="single" w:sz="4" w:space="0" w:color="E7DCCB"/>
+              <w:left w:val="single" w:sz="4" w:space="0" w:color="E7DCCB"/>
+              <w:bottom w:val="single" w:sz="4" w:space="0" w:color="E7DCCB"/>
+              <w:right w:val="single" w:sz="4" w:space="0" w:color="E7DCCB"/>
+            </w:tcBorders>
+            <w:tcMar>
+              <w:top w:w="60" w:type="dxa"/>
+              <w:left w:w="80" w:type="dxa"/>
+              <w:bottom w:w="60" w:type="dxa"/>
+              <w:right w:w="80" w:type="dxa"/>
+            </w:tcMar>
+            <w:vAlign w:val="center"/>
+          </w:tcPr>
+          <w:p>
+            <w:pPr>
+              <w:spacing w:before="0" w:after="0" w:line="252" w:lineRule="auto"/>
+              <w:jc w:val="left"/>
+            </w:pPr>
+            <w:r/>
+            <w:r>
+              <w:rPr>
+                <w:rFonts w:ascii="Sylfaen" w:hAnsi="Sylfaen" w:cs="Sylfaen" w:eastAsia="Sylfaen"/>
+                <w:b w:val="0"/>
+                <w:i w:val="0"/>
+                <w:color w:val="1C2430"/>
+                <w:sz w:val="21"/>
+              </w:rPr>
+              <w:t>8a გამოსახულებაა, 8a=56 ტოლობაა, 8a&gt;50 უტოლობაა. გვ. 57 იწერება რვეულში, მიზეზით. სლაიდზე ეს დავალება არ დგას.</w:t>
+            </w:r>
+          </w:p>
+        </w:tc>
+      </w:tr>
+      <w:tr>
+        <w:trPr>
+          <w:cantSplit/>
+        </w:trPr>
+        <w:tc>
+          <w:tcPr>
+            <w:tcW w:type="dxa" w:w="1474"/>
+            <w:shd w:val="clear" w:fill="FFFFFF"/>
+            <w:tcBorders>
+              <w:top w:val="single" w:sz="4" w:space="0" w:color="E7DCCB"/>
+              <w:left w:val="single" w:sz="4" w:space="0" w:color="E7DCCB"/>
+              <w:bottom w:val="single" w:sz="4" w:space="0" w:color="E7DCCB"/>
+              <w:right w:val="single" w:sz="4" w:space="0" w:color="E7DCCB"/>
+            </w:tcBorders>
+            <w:tcMar>
+              <w:top w:w="60" w:type="dxa"/>
+              <w:left w:w="80" w:type="dxa"/>
+              <w:bottom w:w="60" w:type="dxa"/>
+              <w:right w:w="80" w:type="dxa"/>
+            </w:tcMar>
+            <w:vAlign w:val="center"/>
+          </w:tcPr>
+          <w:p>
+            <w:pPr>
+              <w:spacing w:before="0" w:after="0" w:line="252" w:lineRule="auto"/>
+              <w:jc w:val="left"/>
+            </w:pPr>
+            <w:r/>
+            <w:r>
+              <w:rPr>
+                <w:rFonts w:ascii="Sylfaen" w:hAnsi="Sylfaen" w:cs="Sylfaen" w:eastAsia="Sylfaen"/>
+                <w:b/>
+                <w:i w:val="0"/>
+                <w:color w:val="1C2430"/>
+                <w:sz w:val="21"/>
+              </w:rPr>
+              <w:t>36–40 წთ</w:t>
+            </w:r>
+          </w:p>
+        </w:tc>
+        <w:tc>
+          <w:tcPr>
+            <w:tcW w:type="dxa" w:w="2381"/>
+            <w:shd w:val="clear" w:fill="FFFFFF"/>
+            <w:tcBorders>
+              <w:top w:val="single" w:sz="4" w:space="0" w:color="E7DCCB"/>
+              <w:left w:val="single" w:sz="4" w:space="0" w:color="E7DCCB"/>
+              <w:bottom w:val="single" w:sz="4" w:space="0" w:color="E7DCCB"/>
+              <w:right w:val="single" w:sz="4" w:space="0" w:color="E7DCCB"/>
+            </w:tcBorders>
+            <w:tcMar>
+              <w:top w:w="60" w:type="dxa"/>
+              <w:left w:w="80" w:type="dxa"/>
+              <w:bottom w:w="60" w:type="dxa"/>
+              <w:right w:w="80" w:type="dxa"/>
+            </w:tcMar>
+            <w:vAlign w:val="center"/>
+          </w:tcPr>
+          <w:p>
+            <w:pPr>
+              <w:spacing w:before="0" w:after="0" w:line="252" w:lineRule="auto"/>
+              <w:jc w:val="left"/>
+            </w:pPr>
+            <w:r/>
+            <w:r>
+              <w:rPr>
+                <w:rFonts w:ascii="Sylfaen" w:hAnsi="Sylfaen" w:cs="Sylfaen" w:eastAsia="Sylfaen"/>
+                <w:b/>
+                <w:i w:val="0"/>
+                <w:color w:val="1C2430"/>
+                <w:sz w:val="21"/>
+              </w:rPr>
+              <w:t>შეჯამება და საშინაო</w:t>
+            </w:r>
+          </w:p>
+        </w:tc>
+        <w:tc>
+          <w:tcPr>
+            <w:tcW w:type="dxa" w:w="6123"/>
+            <w:shd w:val="clear" w:fill="FFFFFF"/>
+            <w:tcBorders>
+              <w:top w:val="single" w:sz="4" w:space="0" w:color="E7DCCB"/>
+              <w:left w:val="single" w:sz="4" w:space="0" w:color="E7DCCB"/>
+              <w:bottom w:val="single" w:sz="4" w:space="0" w:color="E7DCCB"/>
+              <w:right w:val="single" w:sz="4" w:space="0" w:color="E7DCCB"/>
+            </w:tcBorders>
+            <w:tcMar>
+              <w:top w:w="60" w:type="dxa"/>
+              <w:left w:w="80" w:type="dxa"/>
+              <w:bottom w:w="60" w:type="dxa"/>
+              <w:right w:w="80" w:type="dxa"/>
+            </w:tcMar>
+            <w:vAlign w:val="center"/>
+          </w:tcPr>
+          <w:p>
+            <w:pPr>
+              <w:spacing w:before="0" w:after="0" w:line="252" w:lineRule="auto"/>
+              <w:jc w:val="left"/>
+            </w:pPr>
+            <w:r/>
+            <w:r>
+              <w:rPr>
+                <w:rFonts w:ascii="Sylfaen" w:hAnsi="Sylfaen" w:cs="Sylfaen" w:eastAsia="Sylfaen"/>
+                <w:b w:val="0"/>
+                <w:i w:val="0"/>
+                <w:color w:val="1C2430"/>
+                <w:sz w:val="21"/>
+              </w:rPr>
+              <w:t>სამი წინადადება თავისი სიტყვით. საშინაო იწერება დაფაზე, სლაიდზე კი არა: გვ. 57, №1–№5, და a-თი ერთი გამოსახულება, ერთი ტოლობა, ერთი უტოლობა.</w:t>
+            </w:r>
+          </w:p>
+        </w:tc>
+      </w:tr>
+    </w:tbl>
     <w:p>
       <w:pPr>
         <w:spacing w:before="240" w:after="80" w:line="259" w:lineRule="auto"/>
@@ -489,7 +1736,7 @@
           <w:color w:val="8E2F3C"/>
           <w:sz w:val="28"/>
         </w:rPr>
-        <w:t>წინარე ცოდნა</w:t>
+        <w:t>0–3 წთ. წინარე ცოდნა</w:t>
       </w:r>
     </w:p>
     <w:p>
@@ -519,7 +1766,7 @@
           <w:color w:val="8E2F3C"/>
           <w:sz w:val="28"/>
         </w:rPr>
-        <w:t>ამოცანა</w:t>
+        <w:t>3–8 წთ. ამოცანა</w:t>
       </w:r>
     </w:p>
     <w:p>
@@ -549,7 +1796,7 @@
           <w:color w:val="8E2F3C"/>
           <w:sz w:val="28"/>
         </w:rPr>
-        <w:t>გადანაცვლებადობის თვისება</w:t>
+        <w:t>8–12 წთ. გადანაცვლებადობის თვისება</w:t>
       </w:r>
     </w:p>
     <w:p>
@@ -564,7 +1811,7 @@
           <w:color w:val="1C2430"/>
           <w:sz w:val="24"/>
         </w:rPr>
-        <w:t>მეზობელი წყვილები იყოფიან: ერთი ითვლის 6·5-ს, მეორე 5·6-ს. ნამრავლი იგივეა, 30. წყვილი ამბობს, რა არ შეიცვალა. მერე ერქმევა სახელი — გადანაცვლებადობის თვისება — და იწერება a·b=b·a. სურვილისამებრ ორი მოსწავლე ადგილსაც იცვლის, ნამრავლი ისევ 30 რჩება.</w:t>
+        <w:t>მეზობელი წყვილები იყოფიან: ერთი ითვლის 6·5-ს, მეორე 5·6-ს. ნამრავლი იგივეა, 30. წყვილი ამბობს, რა არ შეიცვალა. მერე ერქმევა სახელი — გადანაცვლებადობის თვისება — და იწერება a·b=b·a.</w:t>
       </w:r>
     </w:p>
     <w:p>
@@ -579,7 +1826,7 @@
           <w:color w:val="8E2F3C"/>
           <w:sz w:val="28"/>
         </w:rPr>
-        <w:t>ერთი და ნული</w:t>
+        <w:t>12–15 წთ. ერთი და ნული</w:t>
       </w:r>
     </w:p>
     <w:p>
@@ -609,7 +1856,7 @@
           <w:color w:val="8E2F3C"/>
           <w:sz w:val="28"/>
         </w:rPr>
-        <w:t>ჯუფთებადობის თვისება</w:t>
+        <w:t>15–19 წთ. ჯუფთებადობის თვისება</w:t>
       </w:r>
     </w:p>
     <w:p>
@@ -639,7 +1886,7 @@
           <w:color w:val="8E2F3C"/>
           <w:sz w:val="28"/>
         </w:rPr>
-        <w:t>განრიგებადობის თვისება</w:t>
+        <w:t>19–25 წთ. განრიგებადობის თვისება</w:t>
       </w:r>
     </w:p>
     <w:p>
@@ -669,7 +1916,7 @@
           <w:color w:val="8E2F3C"/>
           <w:sz w:val="28"/>
         </w:rPr>
-        <w:t>საერთო მამრავლი</w:t>
+        <w:t>25–28 წთ. საერთო მამრავლი</w:t>
       </w:r>
     </w:p>
     <w:p>
@@ -699,7 +1946,7 @@
           <w:color w:val="8E2F3C"/>
           <w:sz w:val="28"/>
         </w:rPr>
-        <w:t>ასოთი და სამი სახის ჩანაწერი</w:t>
+        <w:t>28–32 წთ. ასოთი</w:t>
       </w:r>
     </w:p>
     <w:p>
@@ -744,7 +1991,7 @@
           <w:color w:val="8E2F3C"/>
           <w:sz w:val="28"/>
         </w:rPr>
-        <w:t>გვ. 57</w:t>
+        <w:t>32–36 წთ. სამი ჩანაწერი და გვ. 57 რვეულში</w:t>
       </w:r>
     </w:p>
     <w:p>
@@ -759,22 +2006,7 @@
           <w:color w:val="1C2430"/>
           <w:sz w:val="24"/>
         </w:rPr>
-        <w:t>პირველ კითხვას წყვილი ერთად ხსნის და ხმამაღლა ამბობს მიზეზს. დანარჩენ ოთხს ცალ-ცალკე წერენ, რომ ჩანდეს, ვის რა გამოუვიდა. მიზეზი აუცილებელია: ნულის თვისებაა, ხუთი ერთნაირი შესაკრებია თუ განრიგებადობა. კითხვები: თუ a ნებისმიერი რიცხვია, რას უდრის 0·a; 27+27+27+27+27 როგორ დაიწეროს გამრავლებით; თუ a=7, რას უდრის 8a; თუ a=0, რას უდრის 11a; 7(a+c) როგორ გაიხსნას. იგივეა (a+c)·7.</w:t>
-      </w:r>
-    </w:p>
-    <w:p>
-      <w:pPr>
-        <w:spacing w:before="0" w:after="120" w:line="269" w:lineRule="auto"/>
-      </w:pPr>
-      <w:r>
-        <w:rPr>
-          <w:rFonts w:ascii="Sylfaen" w:hAnsi="Sylfaen" w:cs="Sylfaen" w:eastAsia="Sylfaen"/>
-          <w:b w:val="0"/>
-          <w:i w:val="0"/>
-          <w:color w:val="1C2430"/>
-          <w:sz w:val="24"/>
-        </w:rPr>
-        <w:t>სამი მოსწავლე ბოლოს თითო წინადადებას ამბობს თავისი სიტყვით. ერთი — გადანაცვლებადობას, მეორე — იმას, რომ ერთზე გამრავლება რიცხვს არ ცვლის, მესამე — 8a გამოსახულებაა, 8a=56 ტოლობაა, 8a&gt;50 უტოლობაა.</w:t>
+        <w:t>პირველ კითხვას წყვილი ერთად ხსნის და ხმამაღლა ამბობს მიზეზს. დანარჩენ ოთხს ცალ-ცალკე წერენ რვეულში, სლაიდზე კი ეს დავალება არ დგას. მიზეზი აუცილებელია: ნულის თვისებაა, ხუთი ერთნაირი შესაკრებია თუ განრიგებადობა. კითხვები: თუ a ნებისმიერი რიცხვია, რას უდრის 0·a; 27+27+27+27+27 როგორ დაიწეროს გამრავლებით; თუ a=7, რას უდრის 8a; თუ a=0, რას უდრის 11a; 7(a+c) როგორ გაიხსნას. იგივეა (a+c)·7.</w:t>
       </w:r>
     </w:p>
     <w:p>
@@ -882,7 +2114,7 @@
           <w:color w:val="8E2F3C"/>
           <w:sz w:val="28"/>
         </w:rPr>
-        <w:t>საშინაო</w:t>
+        <w:t>36–40 წთ. შეჯამება. საშინაო დაფაზე</w:t>
       </w:r>
     </w:p>
     <w:p>
@@ -898,7 +2130,23 @@
           <w:color w:val="1C2430"/>
           <w:sz w:val="22"/>
         </w:rPr>
-        <w:t>•  გვ. 57, №1–№5 რვეულში. კლასში ნანახიც მოკლედ ჩაიწერონ, მიზეზით.</w:t>
+        <w:t>•  სამი მოსწავლე თითო წინადადებას ამბობს. საშინაო სლაიდზე არ ჩანს.</w:t>
+      </w:r>
+    </w:p>
+    <w:p>
+      <w:pPr>
+        <w:spacing w:before="0" w:after="40" w:line="259" w:lineRule="auto"/>
+        <w:ind w:left="340"/>
+      </w:pPr>
+      <w:r>
+        <w:rPr>
+          <w:rFonts w:ascii="Sylfaen" w:hAnsi="Sylfaen" w:cs="Sylfaen" w:eastAsia="Sylfaen"/>
+          <w:b w:val="0"/>
+          <w:i w:val="0"/>
+          <w:color w:val="1C2430"/>
+          <w:sz w:val="22"/>
+        </w:rPr>
+        <w:t>•  დაფაზე იწერება: გვ. 57, №1–№5 რვეულში, მიზეზით.</w:t>
       </w:r>
     </w:p>
     <w:p>

</xml_diff>

<commit_message>
Add a natural-number ray exercise and put the Friday hook on the slides.
The class clicks lily pads to land a frog on 0–10. The multiplication slides now open with the deliberate 36 and keep three boxes for the Friday promise.

Co-authored-by: Beka Tevdorashvili <bekatev@users.noreply.github.com>
</commit_message>
<xml_diff>
--- a/lesson/gegma.docx
+++ b/lesson/gegma.docx
@@ -778,7 +778,7 @@
                 <w:color w:val="1C2430"/>
                 <w:sz w:val="21"/>
               </w:rPr>
-              <w:t>რვეულები</w:t>
+              <w:t>შეცდომა და რვეულები</w:t>
             </w:r>
           </w:p>
         </w:tc>
@@ -814,7 +814,7 @@
                 <w:color w:val="1C2430"/>
                 <w:sz w:val="21"/>
               </w:rPr>
-              <w:t>კითხვა: „ხუთი მოსწავლიდან თითოეულს 6 რვეული აქვს. სულ რამდენი რვეულია?“ ორი გზა, ორივე 30. ერთი მოსწავლე ასახელებს მამრავლსა და ნამრავლს.</w:t>
+              <w:t>სლაიდზე შეგნებული შეცდომა: 6·6=36. კლასი იჭერს, 5·6=30 და 6+6+6+6+6. პირველი უჯრა ივსება. მერე ორი გზა და სახელები.</w:t>
             </w:r>
           </w:p>
         </w:tc>
@@ -927,7 +927,7 @@
                 <w:color w:val="1C2430"/>
                 <w:sz w:val="21"/>
               </w:rPr>
-              <w:t>6·5 და 5·6. წყვილი ამბობს, რა არ შეიცვალა. მერე სახელი: გადანაცვლებადობის თვისება, a·b=b·a.</w:t>
+              <w:t>6·5 და 5·6. წყვილი ამბობს, რა არ შეიცვალა, და მეორე უჯრა ივსება. მერე სახელი: გადანაცვლებადობის თვისება, a·b=b·a.</w:t>
             </w:r>
           </w:p>
         </w:tc>
@@ -1492,7 +1492,7 @@
                 <w:color w:val="1C2430"/>
                 <w:sz w:val="21"/>
               </w:rPr>
-              <w:t>8a და a·8. 7(a+c) და (a+c)·7. 9a+7a.</w:t>
+              <w:t>8a და a·8. 7(a+c) და (a+c)·7 — აქ მესამე უჯრა ივსება. 9a+7a.</w:t>
             </w:r>
           </w:p>
         </w:tc>
@@ -1718,7 +1718,7 @@
                 <w:color w:val="1C2430"/>
                 <w:sz w:val="21"/>
               </w:rPr>
-              <w:t>სამი წინადადება თავისი სიტყვით. საშინაო იწერება დაფაზე, სლაიდზე კი არა: გვ. 57, №1–№5, და a-თი ერთი გამოსახულება, ერთი ტოლობა, ერთი უტოლობა.</w:t>
+              <w:t>სამი წინადადება. სამი უჯრა თუ დარჩა, პარასკევს ათი წუთი „მეორე გზა“. საშინაო დაფაზე, სლაიდზე არა: გვ. 57, №1–№5, და a-თი სამი ჩანაწერი.</w:t>
             </w:r>
           </w:p>
         </w:tc>
@@ -1781,7 +1781,22 @@
           <w:color w:val="1C2430"/>
           <w:sz w:val="24"/>
         </w:rPr>
-        <w:t>კითხვა დაფაზე: „ხუთი მოსწავლიდან თითოეულს 6 რვეული აქვს. სულ რამდენი რვეულია?“ წყვილები ორ გზას ეძებენ. ერთი კრებს 6+6+6+6+6, მეორე წერს 5·6. ორივე 30-ია. ერთი მოსწავლე ხმამაღლა კითხულობს 5·6=30-ს და ასახელებს მამრავლსა და ნამრავლს. ეს ტოლობა დაფაზე რჩება.</w:t>
+        <w:t>სლაიდის ზემოთ სამი ცარიელი უჯრა დგას მთელ გაკვეთილზე. მასწავლებელი შეგნებულად ცდება: „ხუთ მოსწავლეს თითო 6 რვეული აქვს, ეს 6·6-ია, სულ 36.“ კლასი იჭერს, რომ მოსწავლე ხუთია. ორი გზა იწერება: 5·6=30 და 6+6+6+6+6. ორივე 30-ია. მაშინ პირველი უჯრა ივსება. ყვირილზე იმავე უჯრას ისევ აჭერენ და ის იშლება. დღეს თამაში არ მიდის: სამივე უჯრა თუ ბოლომდე დარჩება, პარასკევს ათი წუთია.</w:t>
+      </w:r>
+    </w:p>
+    <w:p>
+      <w:pPr>
+        <w:spacing w:before="0" w:after="120" w:line="269" w:lineRule="auto"/>
+      </w:pPr>
+      <w:r>
+        <w:rPr>
+          <w:rFonts w:ascii="Sylfaen" w:hAnsi="Sylfaen" w:cs="Sylfaen" w:eastAsia="Sylfaen"/>
+          <w:b w:val="0"/>
+          <w:i w:val="0"/>
+          <w:color w:val="1C2430"/>
+          <w:sz w:val="24"/>
+        </w:rPr>
+        <w:t>მერე კითხვა ისევ იხსნება: „ხუთი მოსწავლიდან თითოეულს 6 რვეული აქვს. სულ რამდენი რვეულია?“ წყვილები ორ გზას თავად ეძებენ. ერთი მოსწავლე ხმამაღლა კითხულობს 5·6=30-ს და ასახელებს მამრავლსა და ნამრავლს. ეს ტოლობა დაფაზე რჩება.</w:t>
       </w:r>
     </w:p>
     <w:p>
@@ -1811,7 +1826,7 @@
           <w:color w:val="1C2430"/>
           <w:sz w:val="24"/>
         </w:rPr>
-        <w:t>მეზობელი წყვილები იყოფიან: ერთი ითვლის 6·5-ს, მეორე 5·6-ს. ნამრავლი იგივეა, 30. წყვილი ამბობს, რა არ შეიცვალა. მერე ერქმევა სახელი — გადანაცვლებადობის თვისება — და იწერება a·b=b·a.</w:t>
+        <w:t>მეზობელი წყვილები იყოფიან: ერთი ითვლის 6·5-ს, მეორე 5·6-ს. ნამრავლი იგივეა, 30. წყვილი ამბობს, რა არ შეიცვალა, და მეორე უჯრა ივსება. მერე ერქმევა სახელი — გადანაცვლებადობის თვისება — და იწერება a·b=b·a.</w:t>
       </w:r>
     </w:p>
     <w:p>
@@ -1961,7 +1976,7 @@
           <w:color w:val="1C2430"/>
           <w:sz w:val="24"/>
         </w:rPr>
-        <w:t>წყვილი სიტყვიდან ჩანაწერზე გადადის. „a გამრავლებული 8-ზე“ არის 8a და a·8; გადანაცვლებადობით ერთი და იგივეა, 8a კი 8·a-ს ნიშნავს. „a-სა და c-ს ჯამი, გამრავლებული 7-ზე“ ორნაირად იწერება: 7(a+c) და (a+c)·7. „9a-სა და 7a-ს ჯამი“ არის 9a+7a.</w:t>
+        <w:t>წყვილი სიტყვიდან ჩანაწერზე გადადის. „a გამრავლებული 8-ზე“ არის 8a და a·8; გადანაცვლებადობით ერთი და იგივეა, 8a კი 8·a-ს ნიშნავს. „a-სა და c-ს ჯამი, გამრავლებული 7-ზე“ ორნაირად იწერება: 7(a+c) და (a+c)·7. ვინც მეორე ჩანაწერსაც იტყვის, მესამე უჯრას ავსებს. „9a-სა და 7a-ს ჯამი“ არის 9a+7a.</w:t>
       </w:r>
     </w:p>
     <w:p>
@@ -2130,7 +2145,7 @@
           <w:color w:val="1C2430"/>
           <w:sz w:val="22"/>
         </w:rPr>
-        <w:t>•  სამი მოსწავლე თითო წინადადებას ამბობს. საშინაო სლაიდზე არ ჩანს.</w:t>
+        <w:t>•  სამი მოსწავლე თითო წინადადებას ამბობს. საშინაო სლაიდზე არ ჩანს. სამი უჯრა თუ შევსებული დარჩა, პარასკევს ათი წუთი თამაშია, სახელად მეორე გზა. უჯრა თუ დაიშალა, ეს ათი წუთი რვეულშია.</w:t>
       </w:r>
     </w:p>
     <w:p>

</xml_diff>

<commit_message>
Drop cards, inequalities, and fractions from the grade-5 lesson.
The period is now whole-class slides, the page-57 examples, and the three games.

Co-authored-by: Beka Tevdorashvili <bekatev@users.noreply.github.com>
</commit_message>
<xml_diff>
--- a/lesson/gegma.docx
+++ b/lesson/gegma.docx
@@ -444,7 +444,7 @@
           <w:color w:val="1C2430"/>
           <w:sz w:val="24"/>
         </w:rPr>
-        <w:t>მოსწავლემ ამოიცნოს გამრავლების სამი თვისება — გადანაცვლებადობა, ჯუფთებადობა და განრიგებადობა — ჩაწეროს ისინი ასოთი და გაარჩიოს გამოსახულება, ტოლობა და უტოლობა. ერთზე და ნულზე გამრავლება ცალკე დგას, სამ თვისებაში არ შედის.</w:t>
+        <w:t>მოსწავლემ ამოიცნოს გამრავლების სამი თვისება — გადანაცვლებადობა, ჯუფთებადობა და განრიგებადობა — ჩაწეროს ისინი ასოთი და გაარჩიოს გამოსახულება და ტოლობა. ერთზე და ნულზე გამრავლება ცალკე დგას, სამ თვისებაში არ შედის. გაკვეთილი მთელ კლასთან მიდის: ჯერ სლაიდზე ახსნა, მერე მაგალითები, ბოლოს სამი თამაში.</w:t>
       </w:r>
     </w:p>
     <w:p>
@@ -629,7 +629,7 @@
                 <w:color w:val="1C2430"/>
                 <w:sz w:val="21"/>
               </w:rPr>
-              <w:t>0–3 წთ</w:t>
+              <w:t>0–4 წთ</w:t>
             </w:r>
           </w:p>
         </w:tc>
@@ -665,7 +665,7 @@
                 <w:color w:val="1C2430"/>
                 <w:sz w:val="21"/>
               </w:rPr>
-              <w:t>წინარე ცოდნა</w:t>
+              <w:t>შეცდომა და რვეულები</w:t>
             </w:r>
           </w:p>
         </w:tc>
@@ -701,7 +701,7 @@
                 <w:color w:val="1C2430"/>
                 <w:sz w:val="21"/>
               </w:rPr>
-              <w:t>დაფაზე 4+4+4 და 3·4. წყვილი ამბობს, რომელი უფრო მოკლეა. ვინც ჩერდება, სამჯერ ოთხ თითს ითვლის.</w:t>
+              <w:t>სლაიდზე შეგნებული შეცდომა: 6·6=36. კლასი იჭერს, რომ მოსწავლე ხუთია. ორი გზა: 5·6=30 და 6+6+6+6+6.</w:t>
             </w:r>
           </w:p>
         </w:tc>
@@ -742,7 +742,7 @@
                 <w:color w:val="1C2430"/>
                 <w:sz w:val="21"/>
               </w:rPr>
-              <w:t>3–8 წთ</w:t>
+              <w:t>4–8 წთ</w:t>
             </w:r>
           </w:p>
         </w:tc>
@@ -778,7 +778,7 @@
                 <w:color w:val="1C2430"/>
                 <w:sz w:val="21"/>
               </w:rPr>
-              <w:t>შეცდომა და რვეულები</w:t>
+              <w:t>გადანაცვლებადობა</w:t>
             </w:r>
           </w:p>
         </w:tc>
@@ -814,7 +814,7 @@
                 <w:color w:val="1C2430"/>
                 <w:sz w:val="21"/>
               </w:rPr>
-              <w:t>სლაიდზე შეგნებული შეცდომა: 6·6=36. კლასი იჭერს, 5·6=30 და 6+6+6+6+6. პირველი უჯრა ივსება. მერე ორი გზა და სახელები.</w:t>
+              <w:t>6·5 და 5·6. კლასი ამბობს, რა არ შეიცვალა. მერე სახელი: გადანაცვლებადობის თვისება, a·b=b·a.</w:t>
             </w:r>
           </w:p>
         </w:tc>
@@ -855,7 +855,7 @@
                 <w:color w:val="1C2430"/>
                 <w:sz w:val="21"/>
               </w:rPr>
-              <w:t>8–12 წთ</w:t>
+              <w:t>8–11 წთ</w:t>
             </w:r>
           </w:p>
         </w:tc>
@@ -891,7 +891,7 @@
                 <w:color w:val="1C2430"/>
                 <w:sz w:val="21"/>
               </w:rPr>
-              <w:t>გადანაცვლებადობა</w:t>
+              <w:t>ერთი და ნული</w:t>
             </w:r>
           </w:p>
         </w:tc>
@@ -927,7 +927,7 @@
                 <w:color w:val="1C2430"/>
                 <w:sz w:val="21"/>
               </w:rPr>
-              <w:t>6·5 და 5·6. წყვილი ამბობს, რა არ შეიცვალა, და მეორე უჯრა ივსება. მერე სახელი: გადანაცვლებადობის თვისება, a·b=b·a.</w:t>
+              <w:t>7·1=7 და 7·0=0. კლასი ამბობს: ერთზე გამრავლება რიცხვს არ ცვლის. 0·a=0. ეს სამ თვისებაში არ შედის.</w:t>
             </w:r>
           </w:p>
         </w:tc>
@@ -968,7 +968,7 @@
                 <w:color w:val="1C2430"/>
                 <w:sz w:val="21"/>
               </w:rPr>
-              <w:t>12–15 წთ</w:t>
+              <w:t>11–15 წთ</w:t>
             </w:r>
           </w:p>
         </w:tc>
@@ -1004,7 +1004,7 @@
                 <w:color w:val="1C2430"/>
                 <w:sz w:val="21"/>
               </w:rPr>
-              <w:t>ერთი და ნული</w:t>
+              <w:t>ჯუფთებადობა</w:t>
             </w:r>
           </w:p>
         </w:tc>
@@ -1040,7 +1040,7 @@
                 <w:color w:val="1C2430"/>
                 <w:sz w:val="21"/>
               </w:rPr>
-              <w:t>7·1=7 და 7·0=0. კლასი ამბობს: ერთზე გამრავლება რიცხვს არ ცვლის. 0·a=0. ეს სამ თვისებაში არ შედის.</w:t>
+              <w:t>(3·4)·5 და 3·(4·5), ორივე 60. სახელი: ჯუფთებადობის თვისება, (a·b)·c=a·(b·c).</w:t>
             </w:r>
           </w:p>
         </w:tc>
@@ -1081,7 +1081,7 @@
                 <w:color w:val="1C2430"/>
                 <w:sz w:val="21"/>
               </w:rPr>
-              <w:t>15–19 წთ</w:t>
+              <w:t>15–20 წთ</w:t>
             </w:r>
           </w:p>
         </w:tc>
@@ -1117,7 +1117,7 @@
                 <w:color w:val="1C2430"/>
                 <w:sz w:val="21"/>
               </w:rPr>
-              <w:t>ჯუფთებადობა</w:t>
+              <w:t>განრიგებადობა</w:t>
             </w:r>
           </w:p>
         </w:tc>
@@ -1153,7 +1153,7 @@
                 <w:color w:val="1C2430"/>
                 <w:sz w:val="21"/>
               </w:rPr>
-              <w:t>(3·4)·5 და 3·(4·5), ორივე 60. სახელი: ჯუფთებადობის თვისება, (a·b)·c=a·(b·c).</w:t>
+              <w:t>ხუთ ყუთში თითოში 9 და 4 რვეული. ორი გზა, ორივე 65. სახელი: განრიგებადობის თვისება. a(b+c)=ab+ac და (b+c)·a=ba+ca.</w:t>
             </w:r>
           </w:p>
         </w:tc>
@@ -1194,7 +1194,7 @@
                 <w:color w:val="1C2430"/>
                 <w:sz w:val="21"/>
               </w:rPr>
-              <w:t>19–25 წთ</w:t>
+              <w:t>20–23 წთ</w:t>
             </w:r>
           </w:p>
         </w:tc>
@@ -1230,7 +1230,7 @@
                 <w:color w:val="1C2430"/>
                 <w:sz w:val="21"/>
               </w:rPr>
-              <w:t>განრიგებადობა</w:t>
+              <w:t>საერთო მამრავლი</w:t>
             </w:r>
           </w:p>
         </w:tc>
@@ -1266,7 +1266,7 @@
                 <w:color w:val="1C2430"/>
                 <w:sz w:val="21"/>
               </w:rPr>
-              <w:t>ხუთ ყუთში თითოში 9 და 4 რვეული. ორი გზა, ორივე 65. სახელი: განრიგებადობის თვისება. a(b+c)=ab+ac და (b+c)·a=ba+ca.</w:t>
+              <w:t>უკვე ნანახი 5·9+5·4=5·(9+4)-დან იწერება 9a+7a=(9+7)a=16a. მეორე მაგალითი: 4a+5a=9a.</w:t>
             </w:r>
           </w:p>
         </w:tc>
@@ -1307,7 +1307,7 @@
                 <w:color w:val="1C2430"/>
                 <w:sz w:val="21"/>
               </w:rPr>
-              <w:t>25–28 წთ</w:t>
+              <w:t>23–27 წთ</w:t>
             </w:r>
           </w:p>
         </w:tc>
@@ -1343,7 +1343,7 @@
                 <w:color w:val="1C2430"/>
                 <w:sz w:val="21"/>
               </w:rPr>
-              <w:t>საერთო მამრავლი</w:t>
+              <w:t>ასოთი და ჩანაწერი</w:t>
             </w:r>
           </w:p>
         </w:tc>
@@ -1379,7 +1379,7 @@
                 <w:color w:val="1C2430"/>
                 <w:sz w:val="21"/>
               </w:rPr>
-              <w:t>უკვე ნანახი 5·9+5·4=5·(9+4)-დან წერენ 9a+7a=(9+7)a=16a. მეორე წყვილი: 4a+5a=9a.</w:t>
+              <w:t>8a და a·8. 7(a+c) და (a+c)·7. 8a გამოსახულებაა, 8a=56 ტოლობაა. 9a+7a გამოსახულებაა, 9a+7a=16a ტოლობაა.</w:t>
             </w:r>
           </w:p>
         </w:tc>
@@ -1420,7 +1420,7 @@
                 <w:color w:val="1C2430"/>
                 <w:sz w:val="21"/>
               </w:rPr>
-              <w:t>28–32 წთ</w:t>
+              <w:t>27–33 წთ</w:t>
             </w:r>
           </w:p>
         </w:tc>
@@ -1456,7 +1456,7 @@
                 <w:color w:val="1C2430"/>
                 <w:sz w:val="21"/>
               </w:rPr>
-              <w:t>ასოთი</w:t>
+              <w:t>მაგალითები სლაიდზე</w:t>
             </w:r>
           </w:p>
         </w:tc>
@@ -1492,7 +1492,7 @@
                 <w:color w:val="1C2430"/>
                 <w:sz w:val="21"/>
               </w:rPr>
-              <w:t>8a და a·8. 7(a+c) და (a+c)·7 — აქ მესამე უჯრა ივსება. 9a+7a.</w:t>
+              <w:t>გვ. 57, №1–№5. ჯერ მიზეზი, პასუხი მერე იხსნება.</w:t>
             </w:r>
           </w:p>
         </w:tc>
@@ -1533,7 +1533,7 @@
                 <w:color w:val="1C2430"/>
                 <w:sz w:val="21"/>
               </w:rPr>
-              <w:t>32–36 წთ</w:t>
+              <w:t>33–35 წთ</w:t>
             </w:r>
           </w:p>
         </w:tc>
@@ -1569,7 +1569,7 @@
                 <w:color w:val="1C2430"/>
                 <w:sz w:val="21"/>
               </w:rPr>
-              <w:t>სამი ჩანაწერი, რვეული</w:t>
+              <w:t>შეჯამება</w:t>
             </w:r>
           </w:p>
         </w:tc>
@@ -1605,7 +1605,7 @@
                 <w:color w:val="1C2430"/>
                 <w:sz w:val="21"/>
               </w:rPr>
-              <w:t>8a გამოსახულებაა, 8a=56 ტოლობაა, 8a&gt;50 უტოლობაა. გვ. 57 იწერება რვეულში, მიზეზით. სლაიდზე ეს დავალება არ დგას.</w:t>
+              <w:t>სამი მოსწავლე თითო წინადადებას ამბობს: სამი თვისება, ერთი და ნული, გამოსახულება და ტოლობა.</w:t>
             </w:r>
           </w:p>
         </w:tc>
@@ -1646,7 +1646,7 @@
                 <w:color w:val="1C2430"/>
                 <w:sz w:val="21"/>
               </w:rPr>
-              <w:t>36–40 წთ</w:t>
+              <w:t>35–40 წთ</w:t>
             </w:r>
           </w:p>
         </w:tc>
@@ -1682,7 +1682,7 @@
                 <w:color w:val="1C2430"/>
                 <w:sz w:val="21"/>
               </w:rPr>
-              <w:t>შეჯამება და საშინაო</w:t>
+              <w:t>სამი თამაში</w:t>
             </w:r>
           </w:p>
         </w:tc>
@@ -1718,7 +1718,7 @@
                 <w:color w:val="1C2430"/>
                 <w:sz w:val="21"/>
               </w:rPr>
-              <w:t>სამი წინადადება. სამი უჯრა თუ დარჩა, პარასკევს ათი წუთი „მეორე გზა“. საშინაო დაფაზე, სლაიდზე არა: გვ. 57, №1–№5, და a-თი სამი ჩანაწერი.</w:t>
+              <w:t>ბაყაყი სხივზე, საიდუმლო რიცხვი, ორი ჩანაწერი. მთელი კლასი, ზედიზედ.</w:t>
             </w:r>
           </w:p>
         </w:tc>
@@ -1736,7 +1736,7 @@
           <w:color w:val="8E2F3C"/>
           <w:sz w:val="28"/>
         </w:rPr>
-        <w:t>0–3 წთ. წინარე ცოდნა</w:t>
+        <w:t>0–4 წთ. შეცდომა და რვეულები</w:t>
       </w:r>
     </w:p>
     <w:p>
@@ -1751,7 +1751,7 @@
           <w:color w:val="1C2430"/>
           <w:sz w:val="24"/>
         </w:rPr>
-        <w:t>დაფაზე ორი ჩანაწერია: 4+4+4 და 3·4. ჰეტეროგენული წყვილი ეუბნება ერთმანეთს, რომელი უფრო მოკლეა და რატომ. ვინც ჩერდება, სამჯერ ოთხ თითს ითვლის. აქ ჩანს, ვინ ხედავს გამრავლებას განმეორებით შეკრებად.</w:t>
+        <w:t>მასწავლებელი შეგნებულად ცდება: „ხუთ მოსწავლეს თითო 6 რვეული აქვს, ეს 6·6-ია, სულ 36.“ კლასი იჭერს, რომ მოსწავლე ხუთია. მერე კითხვა ისევ იხსნება: „ხუთი მოსწავლიდან თითოეულს 6 რვეული აქვს. სულ რამდენი რვეულია?“ კლასი ორ გზას თავად ეძებს: 5·6=30 და 6+6+6+6+6. ორივე 30-ია. ერთი მოსწავლე ხმამაღლა კითხულობს 5·6=30-ს და ასახელებს მამრავლსა და ნამრავლს. ეს ტოლობა დაფაზე რჩება.</w:t>
       </w:r>
     </w:p>
     <w:p>
@@ -1766,7 +1766,7 @@
           <w:color w:val="8E2F3C"/>
           <w:sz w:val="28"/>
         </w:rPr>
-        <w:t>3–8 წთ. ამოცანა</w:t>
+        <w:t>4–8 წთ. გადანაცვლებადობის თვისება</w:t>
       </w:r>
     </w:p>
     <w:p>
@@ -1781,22 +1781,7 @@
           <w:color w:val="1C2430"/>
           <w:sz w:val="24"/>
         </w:rPr>
-        <w:t>სლაიდის ზემოთ სამი ცარიელი უჯრა დგას მთელ გაკვეთილზე. მასწავლებელი შეგნებულად ცდება: „ხუთ მოსწავლეს თითო 6 რვეული აქვს, ეს 6·6-ია, სულ 36.“ კლასი იჭერს, რომ მოსწავლე ხუთია. ორი გზა იწერება: 5·6=30 და 6+6+6+6+6. ორივე 30-ია. მაშინ პირველი უჯრა ივსება. ყვირილზე იმავე უჯრას ისევ აჭერენ და ის იშლება. დღეს თამაში არ მიდის: სამივე უჯრა თუ ბოლომდე დარჩება, პარასკევს ათი წუთია.</w:t>
-      </w:r>
-    </w:p>
-    <w:p>
-      <w:pPr>
-        <w:spacing w:before="0" w:after="120" w:line="269" w:lineRule="auto"/>
-      </w:pPr>
-      <w:r>
-        <w:rPr>
-          <w:rFonts w:ascii="Sylfaen" w:hAnsi="Sylfaen" w:cs="Sylfaen" w:eastAsia="Sylfaen"/>
-          <w:b w:val="0"/>
-          <w:i w:val="0"/>
-          <w:color w:val="1C2430"/>
-          <w:sz w:val="24"/>
-        </w:rPr>
-        <w:t>მერე კითხვა ისევ იხსნება: „ხუთი მოსწავლიდან თითოეულს 6 რვეული აქვს. სულ რამდენი რვეულია?“ წყვილები ორ გზას თავად ეძებენ. ერთი მოსწავლე ხმამაღლა კითხულობს 5·6=30-ს და ასახელებს მამრავლსა და ნამრავლს. ეს ტოლობა დაფაზე რჩება.</w:t>
+        <w:t>კლასი ითვლის 6·5-სა და 5·6-ს. ნამრავლი იგივეა, 30. მოსწავლეები ამბობენ, რა არ შეიცვალა. მერე ერქმევა სახელი — გადანაცვლებადობის თვისება — და იწერება a·b=b·a.</w:t>
       </w:r>
     </w:p>
     <w:p>
@@ -1811,37 +1796,7 @@
           <w:color w:val="8E2F3C"/>
           <w:sz w:val="28"/>
         </w:rPr>
-        <w:t>8–12 წთ. გადანაცვლებადობის თვისება</w:t>
-      </w:r>
-    </w:p>
-    <w:p>
-      <w:pPr>
-        <w:spacing w:before="0" w:after="120" w:line="269" w:lineRule="auto"/>
-      </w:pPr>
-      <w:r>
-        <w:rPr>
-          <w:rFonts w:ascii="Sylfaen" w:hAnsi="Sylfaen" w:cs="Sylfaen" w:eastAsia="Sylfaen"/>
-          <w:b w:val="0"/>
-          <w:i w:val="0"/>
-          <w:color w:val="1C2430"/>
-          <w:sz w:val="24"/>
-        </w:rPr>
-        <w:t>მეზობელი წყვილები იყოფიან: ერთი ითვლის 6·5-ს, მეორე 5·6-ს. ნამრავლი იგივეა, 30. წყვილი ამბობს, რა არ შეიცვალა, და მეორე უჯრა ივსება. მერე ერქმევა სახელი — გადანაცვლებადობის თვისება — და იწერება a·b=b·a.</w:t>
-      </w:r>
-    </w:p>
-    <w:p>
-      <w:pPr>
-        <w:spacing w:before="240" w:after="80" w:line="259" w:lineRule="auto"/>
-      </w:pPr>
-      <w:r>
-        <w:rPr>
-          <w:rFonts w:ascii="Sylfaen" w:hAnsi="Sylfaen" w:cs="Sylfaen" w:eastAsia="Sylfaen"/>
-          <w:b/>
-          <w:i w:val="0"/>
-          <w:color w:val="8E2F3C"/>
-          <w:sz w:val="28"/>
-        </w:rPr>
-        <w:t>12–15 წთ. ერთი და ნული</w:t>
+        <w:t>8–11 წთ. ერთი და ნული</w:t>
       </w:r>
     </w:p>
     <w:p>
@@ -1871,7 +1826,7 @@
           <w:color w:val="8E2F3C"/>
           <w:sz w:val="28"/>
         </w:rPr>
-        <w:t>15–19 წთ. ჯუფთებადობის თვისება</w:t>
+        <w:t>11–15 წთ. ჯუფთებადობის თვისება</w:t>
       </w:r>
     </w:p>
     <w:p>
@@ -1886,7 +1841,7 @@
           <w:color w:val="1C2430"/>
           <w:sz w:val="24"/>
         </w:rPr>
-        <w:t>კლასი ორ ნაწილად იყოფა. ერთი მხარე ითვლის (3·4)·5=12·5=60, მეორე 3·(4·5)=3·20=60. მოსწავლეები ამბობენ, რომ ფრჩხილის ადგილმა ნამრავლი არ შეცვალა. სახელი: ჯუფთებადობის თვისება. ჩანაწერი: (a·b)·c=a·(b·c). ერთი მაგალითი საკმარისია.</w:t>
+        <w:t>სლაიდზე ორივე ანგარიშია. კლასი ითვლის (3·4)·5=12·5=60 და 3·(4·5)=3·20=60. მოსწავლეები ამბობენ, რომ ფრჩხილის ადგილმა ნამრავლი არ შეცვალა. სახელი: ჯუფთებადობის თვისება. ჩანაწერი: (a·b)·c=a·(b·c). ერთი მაგალითი საკმარისია.</w:t>
       </w:r>
     </w:p>
     <w:p>
@@ -1901,7 +1856,7 @@
           <w:color w:val="8E2F3C"/>
           <w:sz w:val="28"/>
         </w:rPr>
-        <w:t>19–25 წთ. განრიგებადობის თვისება</w:t>
+        <w:t>15–20 წთ. განრიგებადობის თვისება</w:t>
       </w:r>
     </w:p>
     <w:p>
@@ -1916,7 +1871,7 @@
           <w:color w:val="1C2430"/>
           <w:sz w:val="24"/>
         </w:rPr>
-        <w:t>ახალი ამოცანა: ხუთ ყუთში თითოში 9 წითელი და 4 ლურჯი რვეული დევს. სულ რამდენია? წყვილი თავად ირჩევს გზას. ზოგი წერს 5·(9+4)=5·13=65, ზოგი 5·9+5·4=45+20=65. ფურცლებს უცვლიან და ამოწმებენ, ერთი რიცხვი გამოვიდა თუ არა. აქედან ჩნდება სახელი — განრიგებადობის თვისება ჯამის მიმართ — და ჩანაწერი a(b+c)=ab+ac. გადანაცვლებადობით იგივეა მარჯვნიდანაც: (b+c)·a=ba+ca. სამ შესაკრებზე ერთი მაგალითი: 6·(2+3+5)=6·2+6·3+6·5=60. გამოკლებაზე: 5·(9−4)=5·9−5·4, ანუ a(b−c)=ab−ac.</w:t>
+        <w:t>ახალი ამოცანა: ხუთ ყუთში თითოში 9 წითელი და 4 ლურჯი რვეული დევს. სულ რამდენია? კლასი თავად ირჩევს გზას. ზოგი ამბობს 5·(9+4)=5·13=65, ზოგი 5·9+5·4=45+20=65. დაბალი მზაობა ჯერ კრებს უკვე დათვლილ 45-სა და 20-ს. მაღალი მზაობა ხსნის a(b−c)-ს. აქედან ჩნდება სახელი — განრიგებადობის თვისება ჯამის მიმართ — და ჩანაწერი a(b+c)=ab+ac. გადანაცვლებადობით იგივეა მარჯვნიდანაც: (b+c)·a=ba+ca. სამ შესაკრებზე ერთი მაგალითი: 6·(2+3+5)=6·2+6·3+6·5=60. გამოკლებაზე: 5·(9−4)=5·9−5·4, ანუ a(b−c)=ab−ac.</w:t>
       </w:r>
     </w:p>
     <w:p>
@@ -1931,7 +1886,7 @@
           <w:color w:val="8E2F3C"/>
           <w:sz w:val="28"/>
         </w:rPr>
-        <w:t>25–28 წთ. საერთო მამრავლი</w:t>
+        <w:t>20–23 წთ. საერთო მამრავლი</w:t>
       </w:r>
     </w:p>
     <w:p>
@@ -1946,7 +1901,7 @@
           <w:color w:val="1C2430"/>
           <w:sz w:val="24"/>
         </w:rPr>
-        <w:t>9a+7a ახალი კანონი არ არის. დაფაზე გვერდიგვერდ დგას უკვე ნანახი 5·9+5·4=5·(9+4) და კითხვა: „მაშინ 9a+7a რას უდრის?“ წყვილი ხედავს, რომ a ორივე შესაკრებში დგას, და წერს (9+7)a=16a. ეს განრიგებადობაა უკან წაკითხული: საერთო მამრავლი ფრჩხილებს გარეთ გადის. მეორე წყვილი ამოწმებს 4a+5a=9a.</w:t>
+        <w:t>9a+7a ახალი კანონი არ არის. სლაიდზე გვერდიგვერდ დგას უკვე ნანახი 5·9+5·4=5·(9+4) და კითხვა: „მაშინ 9a+7a რას უდრის?“ კლასი ხედავს, რომ a ორივე შესაკრებში დგას, და იხსნება (9+7)a=16a. ეს განრიგებადობაა უკან წაკითხული: საერთო მამრავლი ფრჩხილებს გარეთ გადის. მეორე მაგალითია 4a+5a=9a.</w:t>
       </w:r>
     </w:p>
     <w:p>
@@ -1961,7 +1916,7 @@
           <w:color w:val="8E2F3C"/>
           <w:sz w:val="28"/>
         </w:rPr>
-        <w:t>28–32 წთ. ასოთი</w:t>
+        <w:t>23–27 წთ. ასოთი, გამოსახულება და ტოლობა</w:t>
       </w:r>
     </w:p>
     <w:p>
@@ -1976,7 +1931,7 @@
           <w:color w:val="1C2430"/>
           <w:sz w:val="24"/>
         </w:rPr>
-        <w:t>წყვილი სიტყვიდან ჩანაწერზე გადადის. „a გამრავლებული 8-ზე“ არის 8a და a·8; გადანაცვლებადობით ერთი და იგივეა, 8a კი 8·a-ს ნიშნავს. „a-სა და c-ს ჯამი, გამრავლებული 7-ზე“ ორნაირად იწერება: 7(a+c) და (a+c)·7. ვინც მეორე ჩანაწერსაც იტყვის, მესამე უჯრას ავსებს. „9a-სა და 7a-ს ჯამი“ არის 9a+7a.</w:t>
+        <w:t>კლასი სიტყვიდან ჩანაწერზე გადადის. „a გამრავლებული 8-ზე“ არის 8a და a·8; გადანაცვლებადობით ერთი და იგივეა, 8a კი 8·a-ს ნიშნავს. „a-სა და c-ს ჯამი, გამრავლებული 7-ზე“ ორნაირად იწერება: 7(a+c) და (a+c)·7. „9a-სა და 7a-ს ჯამი“ არის 9a+7a.</w:t>
       </w:r>
     </w:p>
     <w:p>
@@ -1991,7 +1946,7 @@
           <w:color w:val="1C2430"/>
           <w:sz w:val="24"/>
         </w:rPr>
-        <w:t>მერე სამ სვეტად ალაგებენ. 8a გამოსახულებაა: მოქმედება წერია და ტოლობის ნიშანი არ აქვს. 8a=56 ტოლობაა. 8a&gt;50 უტოლობაა, აქ &gt; ან &lt; დგას. იგივე სვეტში მეორე რიგია 9a+7a, 9a+7a=16a და 16a&gt;10a.</w:t>
+        <w:t>მერე ორ სახედ არჩევენ. 8a გამოსახულებაა: მოქმედება წერია და ტოლობის ნიშანი არ აქვს. 8a=56 ტოლობაა. იგივე წესით 9a+7a გამოსახულებაა, 9a+7a=16a კი ტოლობაა და განრიგებადობიდან მოდის.</w:t>
       </w:r>
     </w:p>
     <w:p>
@@ -2006,7 +1961,7 @@
           <w:color w:val="8E2F3C"/>
           <w:sz w:val="28"/>
         </w:rPr>
-        <w:t>32–36 წთ. სამი ჩანაწერი და გვ. 57 რვეულში</w:t>
+        <w:t>27–33 წთ. მაგალითები სლაიდზე</w:t>
       </w:r>
     </w:p>
     <w:p>
@@ -2021,7 +1976,7 @@
           <w:color w:val="1C2430"/>
           <w:sz w:val="24"/>
         </w:rPr>
-        <w:t>პირველ კითხვას წყვილი ერთად ხსნის და ხმამაღლა ამბობს მიზეზს. დანარჩენ ოთხს ცალ-ცალკე წერენ რვეულში, სლაიდზე კი ეს დავალება არ დგას. მიზეზი აუცილებელია: ნულის თვისებაა, ხუთი ერთნაირი შესაკრებია თუ განრიგებადობა. კითხვები: თუ a ნებისმიერი რიცხვია, რას უდრის 0·a; 27+27+27+27+27 როგორ დაიწეროს გამრავლებით; თუ a=7, რას უდრის 8a; თუ a=0, რას უდრის 11a; 7(a+c) როგორ გაიხსნას. იგივეა (a+c)·7.</w:t>
+        <w:t>გვ. 57 სლაიდზე კეთდება. ჯერ მიზეზს ამბობენ, პასუხი მერე იხსნება. მიზეზი აუცილებელია: ნულის თვისებაა, ხუთი ერთნაირი შესაკრებია თუ განრიგებადობა. კითხვები: თუ a ნებისმიერი რიცხვია, რას უდრის 0·a; 27+27+27+27+27 როგორ დაიწეროს გამრავლებით; თუ a=7, რას უდრის 8a; თუ a=0, რას უდრის 11a; 7(a+c) როგორ გაიხსნას. იგივეა (a+c)·7.</w:t>
       </w:r>
     </w:p>
     <w:p>
@@ -2114,7 +2069,7 @@
           <w:color w:val="1C2430"/>
           <w:sz w:val="24"/>
         </w:rPr>
-        <w:t>მიზანი ყველასთვის ერთია. იცვლება გზა და ის, რასაც ბოლოს აბარებს. აღმოჩენა ჰეტეროგენულ წყვილშია, სახელის დარქმევა მთელ კლასთან, გვ. 57-ის ბოლო ოთხი კითხვა ცალ-ცალკე. ვისაც უჭირს, ბარათზე შეკრება უკვე გახსნილი ხვდება და 5·9+5·4-ზე რჩება; ასოზე მაშინ გადადის, როცა ორი გზა უკვე ერთ რიცხვს იძლევა. პროდუქტი მოკლეა: ორი გზა და 4a+5a. ვისაც ადვილად გამოსდის, იმავე ამოცანის შემდეგ თავად წერს ერთ უტოლობას a-თი და ხსნის a(b−c)-ს.</w:t>
+        <w:t>მიზანი ყველასთვის ერთია. იცვლება გზა და ის, რასაც ბოლოს ამბობს. მთელი კლასი ერთ სლაიდზე მუშაობს. ვისაც უჭირს, 5·9+5·4-ზე რჩება, სადაც 45 და 20 უკვე დათვლილია, და ასოზე მაშინ გადადის, როცა ორი გზა უკვე ერთ რიცხვს იძლევა. პროდუქტი მოკლეა: ორი გზა და 4a+5a. ვისაც ადვილად გამოსდის, იმავე ამოცანის შემდეგ ხსნის a(b−c)-ს.</w:t>
       </w:r>
     </w:p>
     <w:p>
@@ -2129,7 +2084,7 @@
           <w:color w:val="8E2F3C"/>
           <w:sz w:val="28"/>
         </w:rPr>
-        <w:t>36–40 წთ. შეჯამება. საშინაო დაფაზე</w:t>
+        <w:t>33–40 წთ. შეჯამება და სამი თამაში</w:t>
       </w:r>
     </w:p>
     <w:p>
@@ -2145,7 +2100,7 @@
           <w:color w:val="1C2430"/>
           <w:sz w:val="22"/>
         </w:rPr>
-        <w:t>•  სამი მოსწავლე თითო წინადადებას ამბობს. საშინაო სლაიდზე არ ჩანს. სამი უჯრა თუ შევსებული დარჩა, პარასკევს ათი წუთი თამაშია, სახელად მეორე გზა. უჯრა თუ დაიშალა, ეს ათი წუთი რვეულშია.</w:t>
+        <w:t>•  სამი მოსწავლე თითო წინადადებას ამბობს: გადანაცვლებადობას, იმას, რომ ერთზე გამრავლება რიცხვს არ ცვლის, და იმას, რომ 8a გამოსახულებაა, 8a=56 კი ტოლობაა.</w:t>
       </w:r>
     </w:p>
     <w:p>
@@ -2161,7 +2116,7 @@
           <w:color w:val="1C2430"/>
           <w:sz w:val="22"/>
         </w:rPr>
-        <w:t>•  დაფაზე იწერება: გვ. 57, №1–№5 რვეულში, მიზეზით.</w:t>
+        <w:t>•  35–40 წუთი მთელი კლასი თამაშობს: ბაყაყი სხივზე, საიდუმლო რიცხვი, ორი ჩანაწერი.</w:t>
       </w:r>
     </w:p>
     <w:p>
@@ -2177,7 +2132,7 @@
           <w:color w:val="1C2430"/>
           <w:sz w:val="22"/>
         </w:rPr>
-        <w:t>•  ასო a-თი სამი ჩანაწერი: ერთი გამოსახულება, ერთი ტოლობა და ერთი უტოლობა. მაგალითად 8a, 8a=56, 8a&gt;50.</w:t>
+        <w:t>•  თამაშში ჩანაწერს ირჩევენ იგივე ნამრავლით და ასახელებენ თვისებას.</w:t>
       </w:r>
     </w:p>
     <w:p>

</xml_diff>